<commit_message>
Update task 2 output image
</commit_message>
<xml_diff>
--- a/Introduction to DB-Course Project 2.docx
+++ b/Introduction to DB-Course Project 2.docx
@@ -80,11 +80,10 @@
                               <w:dataBinding w:prefixMappings="xmlns:ns0='http://purl.org/dc/elements/1.1/' xmlns:ns1='http://schemas.openxmlformats.org/package/2006/metadata/core-properties' " w:xpath="/ns1:coreProperties[1]/ns0:title[1]" w:storeItemID="{6C3C8BC8-F283-45AE-878A-BAB7291924A1}"/>
                               <w:text/>
                             </w:sdtPr>
-                            <w:sdtEndPr/>
                             <w:sdtContent>
                               <w:p>
                                 <w:pPr>
-                                  <w:pStyle w:val="Title"/>
+                                  <w:pStyle w:val="a9"/>
                                   <w:jc w:val="center"/>
                                   <w:rPr>
                                     <w:sz w:val="96"/>
@@ -103,7 +102,7 @@
                           </w:sdt>
                           <w:p>
                             <w:pPr>
-                              <w:pStyle w:val="Subtitle"/>
+                              <w:pStyle w:val="a6"/>
                               <w:ind w:left="709" w:right="720"/>
                               <w:jc w:val="center"/>
                               <w:rPr>
@@ -138,7 +137,6 @@
                                 <w:dataBinding w:prefixMappings="xmlns:ns0='http://purl.org/dc/elements/1.1/' xmlns:ns1='http://schemas.openxmlformats.org/package/2006/metadata/core-properties' " w:xpath="/ns1:coreProperties[1]/ns0:subject[1]" w:storeItemID="{6C3C8BC8-F283-45AE-878A-BAB7291924A1}"/>
                                 <w:text/>
                               </w:sdtPr>
-                              <w:sdtEndPr/>
                               <w:sdtContent>
                                 <w:r>
                                   <w:rPr>
@@ -381,7 +379,6 @@
                               <w:dataBinding w:prefixMappings="xmlns:ns0='http://schemas.microsoft.com/office/2006/coverPageProps'" w:xpath="/ns0:CoverPageProperties[1]/ns0:Abstract[1]" w:storeItemID="{55AF091B-3C7A-41E3-B477-F2FDAA23CFDA}"/>
                               <w:text/>
                             </w:sdtPr>
-                            <w:sdtEndPr/>
                             <w:sdtContent>
                               <w:p>
                                 <w:pPr>
@@ -456,7 +453,7 @@
                 <v:stroke joinstyle="miter"/>
                 <v:path gradientshapeok="t" o:connecttype="rect"/>
               </v:shapetype>
-              <v:shape id="Text Box 14" o:spid="_x0000_s1026" type="#_x0000_t202" alt="Report title" style="position:absolute;margin-left:36pt;margin-top:85.4pt;width:540pt;height:148.1pt;z-index:-251641856;visibility:visible;mso-wrap-style:square;mso-width-percent:0;mso-height-percent:0;mso-wrap-distance-left:9pt;mso-wrap-distance-top:0;mso-wrap-distance-right:9pt;mso-wrap-distance-bottom:0;mso-position-horizontal:absolute;mso-position-horizontal-relative:page;mso-position-vertical:absolute;mso-position-vertical-relative:margin;mso-width-percent:0;mso-height-percent:0;mso-width-relative:margin;mso-height-relative:margin;v-text-anchor:bottom" o:gfxdata="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" o:allowoverlap="f" filled="f" stroked="f">
+              <v:shape id="Text Box 14" o:spid="_x0000_s1026" type="#_x0000_t202" alt="Report title" style="position:absolute;margin-left:36pt;margin-top:85.4pt;width:540pt;height:148.1pt;z-index:-251641856;visibility:visible;mso-wrap-style:square;mso-width-percent:0;mso-height-percent:0;mso-wrap-distance-left:9pt;mso-wrap-distance-top:0;mso-wrap-distance-right:9pt;mso-wrap-distance-bottom:0;mso-position-horizontal:absolute;mso-position-horizontal-relative:page;mso-position-vertical:absolute;mso-position-vertical-relative:margin;mso-width-percent:0;mso-height-percent:0;mso-width-relative:margin;mso-height-relative:margin;v-text-anchor:bottom" o:gfxdata="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" o:allowoverlap="f" filled="f" stroked="f">
                 <v:textbox inset="0,0,0,0">
                   <w:txbxContent>
                     <w:sdt>
@@ -474,7 +471,6 @@
                         <w:dataBinding w:prefixMappings="xmlns:ns0='http://purl.org/dc/elements/1.1/' xmlns:ns1='http://schemas.openxmlformats.org/package/2006/metadata/core-properties' " w:xpath="/ns1:coreProperties[1]/ns0:title[1]" w:storeItemID="{6C3C8BC8-F283-45AE-878A-BAB7291924A1}"/>
                         <w:text/>
                       </w:sdtPr>
-                      <w:sdtEndPr/>
                       <w:sdtContent>
                         <w:p>
                           <w:pPr>
@@ -532,7 +528,6 @@
                           <w:dataBinding w:prefixMappings="xmlns:ns0='http://purl.org/dc/elements/1.1/' xmlns:ns1='http://schemas.openxmlformats.org/package/2006/metadata/core-properties' " w:xpath="/ns1:coreProperties[1]/ns0:subject[1]" w:storeItemID="{6C3C8BC8-F283-45AE-878A-BAB7291924A1}"/>
                           <w:text/>
                         </w:sdtPr>
-                        <w:sdtEndPr/>
                         <w:sdtContent>
                           <w:r>
                             <w:rPr>
@@ -775,7 +770,6 @@
                         <w:dataBinding w:prefixMappings="xmlns:ns0='http://schemas.microsoft.com/office/2006/coverPageProps'" w:xpath="/ns0:CoverPageProperties[1]/ns0:Abstract[1]" w:storeItemID="{55AF091B-3C7A-41E3-B477-F2FDAA23CFDA}"/>
                         <w:text/>
                       </w:sdtPr>
-                      <w:sdtEndPr/>
                       <w:sdtContent>
                         <w:p>
                           <w:pPr>
@@ -993,7 +987,7 @@
           </mc:Choice>
           <mc:Fallback>
             <w:pict>
-              <v:shape w14:anchorId="6466823C" id="Text Box 2" o:spid="_x0000_s1027" type="#_x0000_t202" style="position:absolute;margin-left:40.3pt;margin-top:.05pt;width:545.45pt;height:87.55pt;z-index:251679744;visibility:visible;mso-wrap-style:square;mso-width-percent:0;mso-height-percent:0;mso-wrap-distance-left:9pt;mso-wrap-distance-top:7.2pt;mso-wrap-distance-right:9pt;mso-wrap-distance-bottom:7.2pt;mso-position-horizontal:absolute;mso-position-horizontal-relative:page;mso-position-vertical:absolute;mso-position-vertical-relative:text;mso-width-percent:0;mso-height-percent:0;mso-width-relative:margin;mso-height-relative:margin;v-text-anchor:top" o:gfxdata="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" filled="f" stroked="f">
+              <v:shape w14:anchorId="6466823C" id="Text Box 2" o:spid="_x0000_s1027" type="#_x0000_t202" style="position:absolute;margin-left:40.3pt;margin-top:.05pt;width:545.45pt;height:87.55pt;z-index:251679744;visibility:visible;mso-wrap-style:square;mso-width-percent:0;mso-height-percent:0;mso-wrap-distance-left:9pt;mso-wrap-distance-top:7.2pt;mso-wrap-distance-right:9pt;mso-wrap-distance-bottom:7.2pt;mso-position-horizontal:absolute;mso-position-horizontal-relative:page;mso-position-vertical:absolute;mso-position-vertical-relative:text;mso-width-percent:0;mso-height-percent:0;mso-width-relative:margin;mso-height-relative:margin;v-text-anchor:top" o:gfxdata="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" filled="f" stroked="f">
                 <v:textbox>
                   <w:txbxContent>
                     <w:p>
@@ -1110,7 +1104,6 @@
           <w:docPartUnique/>
         </w:docPartObj>
       </w:sdtPr>
-      <w:sdtEndPr/>
       <w:sdtContent>
         <w:p>
           <w:pPr>
@@ -1261,7 +1254,7 @@
                               <w:txbxContent>
                                 <w:p>
                                   <w:pPr>
-                                    <w:pStyle w:val="ListParagraph"/>
+                                    <w:pStyle w:val="af5"/>
                                     <w:numPr>
                                       <w:ilvl w:val="0"/>
                                       <w:numId w:val="6"/>
@@ -1330,7 +1323,7 @@
                                 </w:p>
                                 <w:p>
                                   <w:pPr>
-                                    <w:pStyle w:val="ListParagraph"/>
+                                    <w:pStyle w:val="af5"/>
                                     <w:numPr>
                                       <w:ilvl w:val="0"/>
                                       <w:numId w:val="6"/>
@@ -1351,7 +1344,7 @@
                                 </w:p>
                                 <w:p>
                                   <w:pPr>
-                                    <w:pStyle w:val="ListParagraph"/>
+                                    <w:pStyle w:val="af5"/>
                                     <w:numPr>
                                       <w:ilvl w:val="0"/>
                                       <w:numId w:val="6"/>
@@ -1463,7 +1456,7 @@
                                 </w:p>
                                 <w:p>
                                   <w:pPr>
-                                    <w:pStyle w:val="ListParagraph"/>
+                                    <w:pStyle w:val="af5"/>
                                     <w:numPr>
                                       <w:ilvl w:val="0"/>
                                       <w:numId w:val="6"/>
@@ -1485,7 +1478,7 @@
                                 </w:p>
                                 <w:p>
                                   <w:pPr>
-                                    <w:pStyle w:val="ListParagraph"/>
+                                    <w:pStyle w:val="af5"/>
                                     <w:numPr>
                                       <w:ilvl w:val="0"/>
                                       <w:numId w:val="6"/>
@@ -1513,7 +1506,7 @@
                                 </w:p>
                                 <w:p>
                                   <w:pPr>
-                                    <w:pStyle w:val="ListParagraph"/>
+                                    <w:pStyle w:val="af5"/>
                                     <w:numPr>
                                       <w:ilvl w:val="0"/>
                                       <w:numId w:val="6"/>
@@ -1535,7 +1528,7 @@
                                 </w:p>
                                 <w:p>
                                   <w:pPr>
-                                    <w:pStyle w:val="ListParagraph"/>
+                                    <w:pStyle w:val="af5"/>
                                     <w:numPr>
                                       <w:ilvl w:val="0"/>
                                       <w:numId w:val="6"/>
@@ -1582,7 +1575,7 @@
                                 </w:p>
                                 <w:p>
                                   <w:pPr>
-                                    <w:pStyle w:val="ListParagraph"/>
+                                    <w:pStyle w:val="af5"/>
                                     <w:numPr>
                                       <w:ilvl w:val="0"/>
                                       <w:numId w:val="6"/>
@@ -1604,7 +1597,7 @@
                                 </w:p>
                                 <w:p>
                                   <w:pPr>
-                                    <w:pStyle w:val="ListParagraph"/>
+                                    <w:pStyle w:val="af5"/>
                                     <w:numPr>
                                       <w:ilvl w:val="0"/>
                                       <w:numId w:val="6"/>
@@ -1644,7 +1637,7 @@
                                 </w:p>
                                 <w:p>
                                   <w:pPr>
-                                    <w:pStyle w:val="ListParagraph"/>
+                                    <w:pStyle w:val="af5"/>
                                     <w:numPr>
                                       <w:ilvl w:val="0"/>
                                       <w:numId w:val="6"/>
@@ -1706,8 +1699,8 @@
               </mc:Choice>
               <mc:Fallback>
                 <w:pict>
-                  <v:group w14:anchorId="31857F9A" id="Group 198" o:spid="_x0000_s1028" style="position:absolute;margin-left:-105.75pt;margin-top:341.4pt;width:518.25pt;height:318.6pt;z-index:251677696;mso-wrap-distance-left:14.4pt;mso-wrap-distance-top:3.6pt;mso-wrap-distance-right:14.4pt;mso-wrap-distance-bottom:3.6pt;mso-position-horizontal-relative:margin;mso-position-vertical-relative:margin;mso-width-relative:margin;mso-height-relative:margin" coordorigin=",228" coordsize="35784,22576" o:gfxdata="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">
-                    <v:rect id="Rectangle 199" o:spid="_x0000_s1029" style="position:absolute;top:228;width:35674;height:2448;visibility:visible;mso-wrap-style:square;v-text-anchor:middle" o:gfxdata="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" fillcolor="#ef4623 [3204]" stroked="f" strokeweight="2pt">
+                  <v:group w14:anchorId="31857F9A" id="Group 198" o:spid="_x0000_s1028" style="position:absolute;margin-left:-105.75pt;margin-top:341.4pt;width:518.25pt;height:318.6pt;z-index:251677696;mso-wrap-distance-left:14.4pt;mso-wrap-distance-top:3.6pt;mso-wrap-distance-right:14.4pt;mso-wrap-distance-bottom:3.6pt;mso-position-horizontal-relative:margin;mso-position-vertical-relative:margin;mso-width-relative:margin;mso-height-relative:margin" coordorigin=",228" coordsize="35784,22576" o:gfxdata="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">
+                    <v:rect id="Rectangle 199" o:spid="_x0000_s1029" style="position:absolute;top:228;width:35674;height:2448;visibility:visible;mso-wrap-style:square;v-text-anchor:middle" o:gfxdata="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" fillcolor="#ef4623 [3204]" stroked="f" strokeweight="2pt">
                       <v:textbox>
                         <w:txbxContent>
                           <w:p>
@@ -1736,7 +1729,7 @@
                         </w:txbxContent>
                       </v:textbox>
                     </v:rect>
-                    <v:shape id="Text Box 200" o:spid="_x0000_s1030" type="#_x0000_t202" style="position:absolute;top:2896;width:35784;height:19908;visibility:visible;mso-wrap-style:square;v-text-anchor:top" o:gfxdata="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" filled="f" stroked="f" strokeweight=".5pt">
+                    <v:shape id="Text Box 200" o:spid="_x0000_s1030" type="#_x0000_t202" style="position:absolute;top:2896;width:35784;height:19908;visibility:visible;mso-wrap-style:square;v-text-anchor:top" o:gfxdata="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" filled="f" stroked="f" strokeweight=".5pt">
                       <v:textbox inset=",7.2pt,,0">
                         <w:txbxContent>
                           <w:p>
@@ -2242,7 +2235,6 @@
                                     <w:dataBinding w:prefixMappings="xmlns:ns0='http://schemas.openxmlformats.org/officeDocument/2006/extended-properties' " w:xpath="/ns0:Properties[1]/ns0:Company[1]" w:storeItemID="{6668398D-A668-4E3E-A5EB-62B293D839F1}"/>
                                     <w:text/>
                                   </w:sdtPr>
-                                  <w:sdtEndPr/>
                                   <w:sdtContent>
                                     <w:r>
                                       <w:t>Student Details:                                            CRN:</w:t>
@@ -2306,7 +2298,7 @@
                                     </w:tcPr>
                                     <w:p>
                                       <w:pPr>
-                                        <w:pStyle w:val="Footer"/>
+                                        <w:pStyle w:val="a5"/>
                                         <w:rPr>
                                           <w:b/>
                                           <w:bCs/>
@@ -2344,7 +2336,7 @@
                                     </w:p>
                                     <w:p>
                                       <w:pPr>
-                                        <w:pStyle w:val="Footer"/>
+                                        <w:pStyle w:val="a5"/>
                                         <w:rPr>
                                           <w:b/>
                                           <w:bCs/>
@@ -2375,7 +2367,7 @@
                                     </w:p>
                                     <w:p>
                                       <w:pPr>
-                                        <w:pStyle w:val="Footer"/>
+                                        <w:pStyle w:val="a5"/>
                                         <w:rPr>
                                           <w:b/>
                                           <w:bCs/>
@@ -2413,7 +2405,7 @@
                                     </w:p>
                                     <w:p>
                                       <w:pPr>
-                                        <w:pStyle w:val="Footer"/>
+                                        <w:pStyle w:val="a5"/>
                                         <w:rPr>
                                           <w:b/>
                                           <w:bCs/>
@@ -2451,7 +2443,7 @@
                                     </w:p>
                                     <w:p>
                                       <w:pPr>
-                                        <w:pStyle w:val="Footer"/>
+                                        <w:pStyle w:val="a5"/>
                                         <w:ind w:left="0"/>
                                         <w:rPr>
                                           <w:b/>
@@ -2471,7 +2463,7 @@
                                     </w:tcPr>
                                     <w:p>
                                       <w:pPr>
-                                        <w:pStyle w:val="Footer"/>
+                                        <w:pStyle w:val="a5"/>
                                         <w:ind w:left="0"/>
                                         <w:rPr>
                                           <w:b/>
@@ -2489,7 +2481,7 @@
                                     </w:tcPr>
                                     <w:p>
                                       <w:pPr>
-                                        <w:pStyle w:val="Footer"/>
+                                        <w:pStyle w:val="a5"/>
                                         <w:rPr>
                                           <w:b/>
                                           <w:bCs/>
@@ -2518,7 +2510,7 @@
                                     </w:p>
                                     <w:p>
                                       <w:pPr>
-                                        <w:pStyle w:val="Footer"/>
+                                        <w:pStyle w:val="a5"/>
                                         <w:rPr>
                                           <w:b/>
                                           <w:bCs/>
@@ -2556,7 +2548,7 @@
                                     </w:p>
                                     <w:p>
                                       <w:pPr>
-                                        <w:pStyle w:val="Footer"/>
+                                        <w:pStyle w:val="a5"/>
                                         <w:rPr>
                                           <w:b/>
                                           <w:bCs/>
@@ -2603,7 +2595,7 @@
                                     </w:p>
                                     <w:p>
                                       <w:pPr>
-                                        <w:pStyle w:val="Footer"/>
+                                        <w:pStyle w:val="a5"/>
                                         <w:rPr>
                                           <w:b/>
                                           <w:bCs/>
@@ -2653,7 +2645,7 @@
                                     </w:tcPr>
                                     <w:p>
                                       <w:pPr>
-                                        <w:pStyle w:val="Footer"/>
+                                        <w:pStyle w:val="a5"/>
                                         <w:ind w:left="0"/>
                                       </w:pPr>
                                     </w:p>
@@ -2665,7 +2657,7 @@
                                     </w:tcPr>
                                     <w:p>
                                       <w:pPr>
-                                        <w:pStyle w:val="Footer"/>
+                                        <w:pStyle w:val="a5"/>
                                       </w:pPr>
                                     </w:p>
                                   </w:tc>
@@ -2676,7 +2668,7 @@
                                     </w:tcPr>
                                     <w:p>
                                       <w:pPr>
-                                        <w:pStyle w:val="Footer"/>
+                                        <w:pStyle w:val="a5"/>
                                       </w:pPr>
                                     </w:p>
                                   </w:tc>
@@ -2684,7 +2676,7 @@
                               </w:tbl>
                               <w:p>
                                 <w:pPr>
-                                  <w:pStyle w:val="NoSpacing"/>
+                                  <w:pStyle w:val="ad"/>
                                 </w:pPr>
                               </w:p>
                             </w:txbxContent>
@@ -2709,11 +2701,7 @@
               </mc:Choice>
               <mc:Fallback>
                 <w:pict>
-                  <v:shapetype w14:anchorId="7CBAAF0B" id="_x0000_t202" coordsize="21600,21600" o:spt="202" path="m,l,21600r21600,l21600,xe">
-                    <v:stroke joinstyle="miter"/>
-                    <v:path gradientshapeok="t" o:connecttype="rect"/>
-                  </v:shapetype>
-                  <v:shape id="Text Box 15" o:spid="_x0000_s1031" type="#_x0000_t202" alt="contact info" style="position:absolute;margin-left:36pt;margin-top:228.75pt;width:540pt;height:99.75pt;z-index:251675648;visibility:visible;mso-wrap-style:square;mso-width-percent:1282;mso-height-percent:0;mso-wrap-distance-left:9pt;mso-wrap-distance-top:0;mso-wrap-distance-right:9pt;mso-wrap-distance-bottom:0;mso-position-horizontal:absolute;mso-position-horizontal-relative:page;mso-position-vertical:absolute;mso-position-vertical-relative:margin;mso-width-percent:1282;mso-height-percent:0;mso-width-relative:margin;mso-height-relative:margin;v-text-anchor:bottom" o:gfxdata="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" o:allowoverlap="f" filled="f" stroked="f" strokeweight=".5pt">
+                  <v:shape w14:anchorId="7CBAAF0B" id="Text Box 15" o:spid="_x0000_s1031" type="#_x0000_t202" alt="contact info" style="position:absolute;margin-left:36pt;margin-top:228.75pt;width:540pt;height:99.75pt;z-index:251675648;visibility:visible;mso-wrap-style:square;mso-width-percent:1282;mso-height-percent:0;mso-wrap-distance-left:9pt;mso-wrap-distance-top:0;mso-wrap-distance-right:9pt;mso-wrap-distance-bottom:0;mso-position-horizontal:absolute;mso-position-horizontal-relative:page;mso-position-vertical:absolute;mso-position-vertical-relative:margin;mso-width-percent:1282;mso-height-percent:0;mso-width-relative:margin;mso-height-relative:margin;v-text-anchor:bottom" o:gfxdata="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" o:allowoverlap="f" filled="f" stroked="f" strokeweight=".5pt">
                     <v:textbox inset="0,0,0,0">
                       <w:txbxContent>
                         <w:p>
@@ -2728,7 +2716,6 @@
                               <w:dataBinding w:prefixMappings="xmlns:ns0='http://schemas.openxmlformats.org/officeDocument/2006/extended-properties' " w:xpath="/ns0:Properties[1]/ns0:Company[1]" w:storeItemID="{6668398D-A668-4E3E-A5EB-62B293D839F1}"/>
                               <w:text/>
                             </w:sdtPr>
-                            <w:sdtEndPr/>
                             <w:sdtContent>
                               <w:r>
                                 <w:t>Student Details:                                            CRN:</w:t>
@@ -2792,7 +2779,7 @@
                               </w:tcPr>
                               <w:p>
                                 <w:pPr>
-                                  <w:pStyle w:val="Footer"/>
+                                  <w:pStyle w:val="a5"/>
                                   <w:rPr>
                                     <w:b/>
                                     <w:bCs/>
@@ -2830,7 +2817,7 @@
                               </w:p>
                               <w:p>
                                 <w:pPr>
-                                  <w:pStyle w:val="Footer"/>
+                                  <w:pStyle w:val="a5"/>
                                   <w:rPr>
                                     <w:b/>
                                     <w:bCs/>
@@ -2861,7 +2848,7 @@
                               </w:p>
                               <w:p>
                                 <w:pPr>
-                                  <w:pStyle w:val="Footer"/>
+                                  <w:pStyle w:val="a5"/>
                                   <w:rPr>
                                     <w:b/>
                                     <w:bCs/>
@@ -2899,7 +2886,7 @@
                               </w:p>
                               <w:p>
                                 <w:pPr>
-                                  <w:pStyle w:val="Footer"/>
+                                  <w:pStyle w:val="a5"/>
                                   <w:rPr>
                                     <w:b/>
                                     <w:bCs/>
@@ -2937,7 +2924,7 @@
                               </w:p>
                               <w:p>
                                 <w:pPr>
-                                  <w:pStyle w:val="Footer"/>
+                                  <w:pStyle w:val="a5"/>
                                   <w:ind w:left="0"/>
                                   <w:rPr>
                                     <w:b/>
@@ -2957,7 +2944,7 @@
                               </w:tcPr>
                               <w:p>
                                 <w:pPr>
-                                  <w:pStyle w:val="Footer"/>
+                                  <w:pStyle w:val="a5"/>
                                   <w:ind w:left="0"/>
                                   <w:rPr>
                                     <w:b/>
@@ -2975,7 +2962,7 @@
                               </w:tcPr>
                               <w:p>
                                 <w:pPr>
-                                  <w:pStyle w:val="Footer"/>
+                                  <w:pStyle w:val="a5"/>
                                   <w:rPr>
                                     <w:b/>
                                     <w:bCs/>
@@ -3004,7 +2991,7 @@
                               </w:p>
                               <w:p>
                                 <w:pPr>
-                                  <w:pStyle w:val="Footer"/>
+                                  <w:pStyle w:val="a5"/>
                                   <w:rPr>
                                     <w:b/>
                                     <w:bCs/>
@@ -3042,7 +3029,7 @@
                               </w:p>
                               <w:p>
                                 <w:pPr>
-                                  <w:pStyle w:val="Footer"/>
+                                  <w:pStyle w:val="a5"/>
                                   <w:rPr>
                                     <w:b/>
                                     <w:bCs/>
@@ -3089,7 +3076,7 @@
                               </w:p>
                               <w:p>
                                 <w:pPr>
-                                  <w:pStyle w:val="Footer"/>
+                                  <w:pStyle w:val="a5"/>
                                   <w:rPr>
                                     <w:b/>
                                     <w:bCs/>
@@ -3139,7 +3126,7 @@
                               </w:tcPr>
                               <w:p>
                                 <w:pPr>
-                                  <w:pStyle w:val="Footer"/>
+                                  <w:pStyle w:val="a5"/>
                                   <w:ind w:left="0"/>
                                 </w:pPr>
                               </w:p>
@@ -3151,7 +3138,7 @@
                               </w:tcPr>
                               <w:p>
                                 <w:pPr>
-                                  <w:pStyle w:val="Footer"/>
+                                  <w:pStyle w:val="a5"/>
                                 </w:pPr>
                               </w:p>
                             </w:tc>
@@ -3162,7 +3149,7 @@
                               </w:tcPr>
                               <w:p>
                                 <w:pPr>
-                                  <w:pStyle w:val="Footer"/>
+                                  <w:pStyle w:val="a5"/>
                                 </w:pPr>
                               </w:p>
                             </w:tc>
@@ -3170,7 +3157,7 @@
                         </w:tbl>
                         <w:p>
                           <w:pPr>
-                            <w:pStyle w:val="NoSpacing"/>
+                            <w:pStyle w:val="ad"/>
                           </w:pPr>
                         </w:p>
                       </w:txbxContent>
@@ -3212,7 +3199,7 @@
     </w:p>
     <w:p>
       <w:pPr>
-        <w:pStyle w:val="Heading1"/>
+        <w:pStyle w:val="1"/>
         <w:spacing w:before="0" w:after="0"/>
         <w:rPr>
           <w:rFonts w:ascii="Times New Roman" w:hAnsi="Times New Roman" w:cs="Times New Roman"/>
@@ -3353,7 +3340,7 @@
     </w:p>
     <w:p>
       <w:pPr>
-        <w:pStyle w:val="ListParagraph"/>
+        <w:pStyle w:val="af5"/>
         <w:numPr>
           <w:ilvl w:val="1"/>
           <w:numId w:val="6"/>
@@ -3432,7 +3419,7 @@
     </w:p>
     <w:p>
       <w:pPr>
-        <w:pStyle w:val="ListParagraph"/>
+        <w:pStyle w:val="af5"/>
         <w:numPr>
           <w:ilvl w:val="1"/>
           <w:numId w:val="6"/>
@@ -3518,7 +3505,7 @@
     </w:p>
     <w:p>
       <w:pPr>
-        <w:pStyle w:val="ListParagraph"/>
+        <w:pStyle w:val="af5"/>
         <w:numPr>
           <w:ilvl w:val="1"/>
           <w:numId w:val="6"/>
@@ -3604,7 +3591,7 @@
     </w:p>
     <w:p>
       <w:pPr>
-        <w:pStyle w:val="ListParagraph"/>
+        <w:pStyle w:val="af5"/>
         <w:numPr>
           <w:ilvl w:val="1"/>
           <w:numId w:val="6"/>
@@ -3850,7 +3837,7 @@
     </w:p>
     <w:p>
       <w:pPr>
-        <w:pStyle w:val="ListParagraph"/>
+        <w:pStyle w:val="af5"/>
         <w:numPr>
           <w:ilvl w:val="0"/>
           <w:numId w:val="19"/>
@@ -3875,7 +3862,7 @@
     </w:p>
     <w:p>
       <w:pPr>
-        <w:pStyle w:val="ListParagraph"/>
+        <w:pStyle w:val="af5"/>
         <w:numPr>
           <w:ilvl w:val="0"/>
           <w:numId w:val="19"/>
@@ -3900,7 +3887,7 @@
     </w:p>
     <w:p>
       <w:pPr>
-        <w:pStyle w:val="ListParagraph"/>
+        <w:pStyle w:val="af5"/>
         <w:numPr>
           <w:ilvl w:val="0"/>
           <w:numId w:val="19"/>
@@ -3997,7 +3984,7 @@
     </w:p>
     <w:p>
       <w:pPr>
-        <w:pStyle w:val="ListParagraph"/>
+        <w:pStyle w:val="af5"/>
         <w:numPr>
           <w:ilvl w:val="0"/>
           <w:numId w:val="19"/>
@@ -4360,7 +4347,7 @@
     </w:p>
     <w:p>
       <w:pPr>
-        <w:pStyle w:val="ListParagraph"/>
+        <w:pStyle w:val="af5"/>
         <w:numPr>
           <w:ilvl w:val="0"/>
           <w:numId w:val="7"/>
@@ -4398,7 +4385,7 @@
     </w:p>
     <w:p>
       <w:pPr>
-        <w:pStyle w:val="ListParagraph"/>
+        <w:pStyle w:val="af5"/>
         <w:numPr>
           <w:ilvl w:val="0"/>
           <w:numId w:val="7"/>
@@ -4514,7 +4501,7 @@
     </w:p>
     <w:p>
       <w:pPr>
-        <w:pStyle w:val="Heading1"/>
+        <w:pStyle w:val="1"/>
         <w:rPr>
           <w:rFonts w:ascii="Times New Roman" w:hAnsi="Times New Roman" w:cs="Times New Roman"/>
           <w:color w:val="auto"/>
@@ -4633,16 +4620,16 @@
                         <w:txbxContent>
                           <w:p>
                             <w:pPr>
-                              <w:pStyle w:val="Quote"/>
+                              <w:pStyle w:val="af"/>
                               <w:rPr>
-                                <w:rStyle w:val="QuoteChar"/>
+                                <w:rStyle w:val="Char5"/>
                                 <w:i/>
                                 <w:iCs/>
                               </w:rPr>
                             </w:pPr>
                             <w:r>
                               <w:rPr>
-                                <w:rStyle w:val="QuoteChar"/>
+                                <w:rStyle w:val="Char5"/>
                                 <w:i/>
                                 <w:iCs/>
                               </w:rPr>
@@ -4660,7 +4647,7 @@
                           </w:p>
                           <w:p>
                             <w:pPr>
-                              <w:pStyle w:val="NormalWeb"/>
+                              <w:pStyle w:val="af6"/>
                               <w:shd w:val="clear" w:color="auto" w:fill="FFFFFF"/>
                               <w:spacing w:before="0" w:beforeAutospacing="0" w:after="0" w:afterAutospacing="0" w:line="360" w:lineRule="auto"/>
                               <w:jc w:val="both"/>
@@ -4688,7 +4675,7 @@
                           </w:p>
                           <w:p>
                             <w:pPr>
-                              <w:pStyle w:val="NormalWeb"/>
+                              <w:pStyle w:val="af6"/>
                               <w:shd w:val="clear" w:color="auto" w:fill="FFFFFF"/>
                               <w:spacing w:before="0" w:beforeAutospacing="0" w:after="0" w:afterAutospacing="0"/>
                               <w:rPr>
@@ -4751,7 +4738,7 @@
           </mc:Choice>
           <mc:Fallback>
             <w:pict>
-              <v:shape w14:anchorId="2E8B6DDD" id="Text Box 1" o:spid="_x0000_s1032" type="#_x0000_t202" alt="Sidebar" style="position:absolute;left:0;text-align:left;margin-left:32.5pt;margin-top:6.6pt;width:95.9pt;height:181.45pt;z-index:251681792;visibility:visible;mso-wrap-style:square;mso-width-percent:250;mso-height-percent:950;mso-wrap-distance-left:14.4pt;mso-wrap-distance-top:0;mso-wrap-distance-right:14.4pt;mso-wrap-distance-bottom:3in;mso-position-horizontal:absolute;mso-position-horizontal-relative:page;mso-position-vertical:absolute;mso-position-vertical-relative:margin;mso-width-percent:250;mso-height-percent:950;mso-width-relative:margin;mso-height-relative:margin;v-text-anchor:top" o:gfxdata="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" filled="f" stroked="f" strokeweight=".5pt">
+              <v:shape w14:anchorId="2E8B6DDD" id="Text Box 1" o:spid="_x0000_s1032" type="#_x0000_t202" alt="Sidebar" style="position:absolute;left:0;text-align:left;margin-left:32.5pt;margin-top:6.6pt;width:95.9pt;height:181.45pt;z-index:251681792;visibility:visible;mso-wrap-style:square;mso-width-percent:250;mso-height-percent:950;mso-wrap-distance-left:14.4pt;mso-wrap-distance-top:0;mso-wrap-distance-right:14.4pt;mso-wrap-distance-bottom:3in;mso-position-horizontal:absolute;mso-position-horizontal-relative:page;mso-position-vertical:absolute;mso-position-vertical-relative:margin;mso-width-percent:250;mso-height-percent:950;mso-width-relative:margin;mso-height-relative:margin;v-text-anchor:top" o:gfxdata="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" filled="f" stroked="f" strokeweight=".5pt">
                 <v:textbox inset="3.6pt,0,3.6pt,0">
                   <w:txbxContent>
                     <w:p>
@@ -4913,7 +4900,7 @@
     </w:p>
     <w:p>
       <w:pPr>
-        <w:pStyle w:val="Heading1"/>
+        <w:pStyle w:val="1"/>
       </w:pPr>
       <w:r>
         <w:lastRenderedPageBreak/>
@@ -4922,7 +4909,7 @@
     </w:p>
     <w:p>
       <w:pPr>
-        <w:pStyle w:val="ListBullet"/>
+        <w:pStyle w:val="a"/>
         <w:rPr>
           <w:rFonts w:ascii="Times New Roman" w:hAnsi="Times New Roman" w:cs="Times New Roman"/>
           <w:sz w:val="24"/>
@@ -4940,7 +4927,7 @@
     </w:p>
     <w:p>
       <w:pPr>
-        <w:pStyle w:val="ListBullet"/>
+        <w:pStyle w:val="a"/>
         <w:rPr>
           <w:rFonts w:ascii="Times New Roman" w:hAnsi="Times New Roman" w:cs="Times New Roman"/>
           <w:sz w:val="24"/>
@@ -4960,7 +4947,7 @@
     </w:p>
     <w:p>
       <w:pPr>
-        <w:pStyle w:val="ListBullet"/>
+        <w:pStyle w:val="a"/>
         <w:rPr>
           <w:rFonts w:ascii="Times New Roman" w:hAnsi="Times New Roman" w:cs="Times New Roman"/>
           <w:sz w:val="24"/>
@@ -4978,7 +4965,7 @@
     </w:p>
     <w:p>
       <w:pPr>
-        <w:pStyle w:val="ListBullet"/>
+        <w:pStyle w:val="a"/>
         <w:rPr>
           <w:rFonts w:ascii="Times New Roman" w:hAnsi="Times New Roman" w:cs="Times New Roman"/>
           <w:sz w:val="24"/>
@@ -4996,7 +4983,7 @@
     </w:p>
     <w:p>
       <w:pPr>
-        <w:pStyle w:val="ListBullet"/>
+        <w:pStyle w:val="a"/>
         <w:rPr>
           <w:rFonts w:ascii="Times New Roman" w:hAnsi="Times New Roman" w:cs="Times New Roman"/>
           <w:sz w:val="24"/>
@@ -5014,7 +5001,7 @@
     </w:p>
     <w:p>
       <w:pPr>
-        <w:pStyle w:val="ListBullet"/>
+        <w:pStyle w:val="a"/>
         <w:rPr>
           <w:rFonts w:ascii="Times New Roman" w:hAnsi="Times New Roman" w:cs="Times New Roman"/>
           <w:sz w:val="24"/>
@@ -5032,7 +5019,7 @@
     </w:p>
     <w:p>
       <w:pPr>
-        <w:pStyle w:val="ListBullet"/>
+        <w:pStyle w:val="a"/>
         <w:numPr>
           <w:ilvl w:val="0"/>
           <w:numId w:val="0"/>
@@ -5120,7 +5107,7 @@
     </w:p>
     <w:p>
       <w:pPr>
-        <w:pStyle w:val="ListBullet"/>
+        <w:pStyle w:val="a"/>
         <w:numPr>
           <w:ilvl w:val="0"/>
           <w:numId w:val="0"/>
@@ -6854,7 +6841,7 @@
     </w:p>
     <w:p>
       <w:pPr>
-        <w:pStyle w:val="ListBullet"/>
+        <w:pStyle w:val="a"/>
         <w:numPr>
           <w:ilvl w:val="0"/>
           <w:numId w:val="0"/>
@@ -6869,7 +6856,7 @@
     </w:p>
     <w:p>
       <w:pPr>
-        <w:pStyle w:val="ListBullet"/>
+        <w:pStyle w:val="a"/>
         <w:numPr>
           <w:ilvl w:val="0"/>
           <w:numId w:val="0"/>
@@ -6884,7 +6871,7 @@
     </w:p>
     <w:p>
       <w:pPr>
-        <w:pStyle w:val="ListBullet"/>
+        <w:pStyle w:val="a"/>
         <w:numPr>
           <w:ilvl w:val="0"/>
           <w:numId w:val="0"/>
@@ -6899,7 +6886,7 @@
     </w:p>
     <w:p>
       <w:pPr>
-        <w:pStyle w:val="ListBullet"/>
+        <w:pStyle w:val="a"/>
         <w:numPr>
           <w:ilvl w:val="0"/>
           <w:numId w:val="0"/>
@@ -7695,7 +7682,7 @@
     </w:p>
     <w:p>
       <w:pPr>
-        <w:pStyle w:val="ListBullet"/>
+        <w:pStyle w:val="a"/>
         <w:numPr>
           <w:ilvl w:val="0"/>
           <w:numId w:val="0"/>
@@ -7710,7 +7697,7 @@
     </w:p>
     <w:p>
       <w:pPr>
-        <w:pStyle w:val="Heading1"/>
+        <w:pStyle w:val="1"/>
       </w:pPr>
       <w:r>
         <w:lastRenderedPageBreak/>
@@ -7719,7 +7706,7 @@
     </w:p>
     <w:p>
       <w:pPr>
-        <w:pStyle w:val="ListBullet"/>
+        <w:pStyle w:val="a"/>
         <w:numPr>
           <w:ilvl w:val="0"/>
           <w:numId w:val="0"/>
@@ -7743,7 +7730,7 @@
     </w:p>
     <w:p>
       <w:pPr>
-        <w:pStyle w:val="ListBullet"/>
+        <w:pStyle w:val="a"/>
         <w:rPr>
           <w:rFonts w:ascii="Times New Roman" w:hAnsi="Times New Roman" w:cs="Times New Roman"/>
           <w:color w:val="auto"/>
@@ -7763,7 +7750,7 @@
     </w:p>
     <w:p>
       <w:pPr>
-        <w:pStyle w:val="ListBullet"/>
+        <w:pStyle w:val="a"/>
         <w:rPr>
           <w:rFonts w:ascii="Times New Roman" w:hAnsi="Times New Roman" w:cs="Times New Roman"/>
           <w:color w:val="auto"/>
@@ -7783,7 +7770,7 @@
     </w:p>
     <w:p>
       <w:pPr>
-        <w:pStyle w:val="ListBullet"/>
+        <w:pStyle w:val="a"/>
         <w:rPr>
           <w:rFonts w:ascii="Times New Roman" w:hAnsi="Times New Roman" w:cs="Times New Roman"/>
           <w:color w:val="auto"/>
@@ -7803,7 +7790,7 @@
     </w:p>
     <w:p>
       <w:pPr>
-        <w:pStyle w:val="ListBullet"/>
+        <w:pStyle w:val="a"/>
         <w:numPr>
           <w:ilvl w:val="0"/>
           <w:numId w:val="0"/>
@@ -7818,7 +7805,7 @@
     </w:p>
     <w:p>
       <w:pPr>
-        <w:pStyle w:val="ListBullet"/>
+        <w:pStyle w:val="a"/>
         <w:numPr>
           <w:ilvl w:val="0"/>
           <w:numId w:val="0"/>
@@ -7834,7 +7821,7 @@
     </w:p>
     <w:p>
       <w:pPr>
-        <w:pStyle w:val="ListBullet"/>
+        <w:pStyle w:val="a"/>
         <w:numPr>
           <w:ilvl w:val="0"/>
           <w:numId w:val="0"/>
@@ -7850,7 +7837,7 @@
     </w:p>
     <w:p>
       <w:pPr>
-        <w:pStyle w:val="ListBullet"/>
+        <w:pStyle w:val="a"/>
         <w:numPr>
           <w:ilvl w:val="0"/>
           <w:numId w:val="0"/>
@@ -7879,7 +7866,7 @@
     </w:p>
     <w:p>
       <w:pPr>
-        <w:pStyle w:val="ListBullet"/>
+        <w:pStyle w:val="a"/>
         <w:numPr>
           <w:ilvl w:val="0"/>
           <w:numId w:val="0"/>
@@ -7895,7 +7882,7 @@
     </w:p>
     <w:p>
       <w:pPr>
-        <w:pStyle w:val="ListBullet"/>
+        <w:pStyle w:val="a"/>
         <w:rPr>
           <w:rFonts w:ascii="Times New Roman" w:hAnsi="Times New Roman" w:cs="Times New Roman"/>
           <w:color w:val="auto"/>
@@ -7915,7 +7902,7 @@
     </w:p>
     <w:p>
       <w:pPr>
-        <w:pStyle w:val="ListBullet"/>
+        <w:pStyle w:val="a"/>
         <w:rPr>
           <w:rFonts w:ascii="Times New Roman" w:hAnsi="Times New Roman" w:cs="Times New Roman"/>
           <w:color w:val="auto"/>
@@ -7935,18 +7922,18 @@
     </w:p>
     <w:p>
       <w:pPr>
-        <w:pStyle w:val="ListBullet"/>
-        <w:rPr>
-          <w:rFonts w:ascii="Times New Roman" w:hAnsi="Times New Roman" w:cs="Times New Roman"/>
-          <w:color w:val="auto"/>
-          <w:sz w:val="24"/>
-          <w:szCs w:val="24"/>
-        </w:rPr>
-      </w:pPr>
-    </w:p>
-    <w:p>
-      <w:pPr>
-        <w:pStyle w:val="ListBullet"/>
+        <w:pStyle w:val="a"/>
+        <w:rPr>
+          <w:rFonts w:ascii="Times New Roman" w:hAnsi="Times New Roman" w:cs="Times New Roman"/>
+          <w:color w:val="auto"/>
+          <w:sz w:val="24"/>
+          <w:szCs w:val="24"/>
+        </w:rPr>
+      </w:pPr>
+    </w:p>
+    <w:p>
+      <w:pPr>
+        <w:pStyle w:val="a"/>
         <w:rPr>
           <w:rFonts w:ascii="Times New Roman" w:hAnsi="Times New Roman" w:cs="Times New Roman"/>
           <w:color w:val="auto"/>
@@ -7966,7 +7953,7 @@
     </w:p>
     <w:p>
       <w:pPr>
-        <w:pStyle w:val="ListBullet"/>
+        <w:pStyle w:val="a"/>
         <w:rPr>
           <w:rFonts w:ascii="Times New Roman" w:hAnsi="Times New Roman" w:cs="Times New Roman"/>
           <w:color w:val="auto"/>
@@ -7986,7 +7973,7 @@
     </w:p>
     <w:p>
       <w:pPr>
-        <w:pStyle w:val="ListBullet"/>
+        <w:pStyle w:val="a"/>
         <w:rPr>
           <w:rFonts w:ascii="Times New Roman" w:hAnsi="Times New Roman" w:cs="Times New Roman"/>
           <w:color w:val="auto"/>
@@ -8006,7 +7993,7 @@
     </w:p>
     <w:p>
       <w:pPr>
-        <w:pStyle w:val="ListBullet"/>
+        <w:pStyle w:val="a"/>
         <w:rPr>
           <w:rFonts w:ascii="Times New Roman" w:hAnsi="Times New Roman" w:cs="Times New Roman"/>
           <w:color w:val="auto"/>
@@ -8026,7 +8013,7 @@
     </w:p>
     <w:p>
       <w:pPr>
-        <w:pStyle w:val="ListBullet"/>
+        <w:pStyle w:val="a"/>
         <w:rPr>
           <w:rFonts w:ascii="Times New Roman" w:hAnsi="Times New Roman" w:cs="Times New Roman"/>
           <w:color w:val="auto"/>
@@ -8046,7 +8033,7 @@
     </w:p>
     <w:p>
       <w:pPr>
-        <w:pStyle w:val="ListBullet"/>
+        <w:pStyle w:val="a"/>
         <w:rPr>
           <w:rFonts w:ascii="Times New Roman" w:hAnsi="Times New Roman" w:cs="Times New Roman"/>
           <w:color w:val="auto"/>
@@ -8066,7 +8053,7 @@
     </w:p>
     <w:p>
       <w:pPr>
-        <w:pStyle w:val="ListBullet"/>
+        <w:pStyle w:val="a"/>
         <w:rPr>
           <w:rFonts w:ascii="Times New Roman" w:hAnsi="Times New Roman" w:cs="Times New Roman"/>
           <w:color w:val="auto"/>
@@ -8086,7 +8073,7 @@
     </w:p>
     <w:p>
       <w:pPr>
-        <w:pStyle w:val="ListBullet"/>
+        <w:pStyle w:val="a"/>
         <w:rPr>
           <w:rFonts w:ascii="Times New Roman" w:hAnsi="Times New Roman" w:cs="Times New Roman"/>
           <w:color w:val="auto"/>
@@ -8106,18 +8093,18 @@
     </w:p>
     <w:p>
       <w:pPr>
-        <w:pStyle w:val="ListBullet"/>
-        <w:rPr>
-          <w:rFonts w:ascii="Times New Roman" w:hAnsi="Times New Roman" w:cs="Times New Roman"/>
-          <w:color w:val="auto"/>
-          <w:sz w:val="24"/>
-          <w:szCs w:val="24"/>
-        </w:rPr>
-      </w:pPr>
-    </w:p>
-    <w:p>
-      <w:pPr>
-        <w:pStyle w:val="ListBullet"/>
+        <w:pStyle w:val="a"/>
+        <w:rPr>
+          <w:rFonts w:ascii="Times New Roman" w:hAnsi="Times New Roman" w:cs="Times New Roman"/>
+          <w:color w:val="auto"/>
+          <w:sz w:val="24"/>
+          <w:szCs w:val="24"/>
+        </w:rPr>
+      </w:pPr>
+    </w:p>
+    <w:p>
+      <w:pPr>
+        <w:pStyle w:val="a"/>
         <w:rPr>
           <w:rFonts w:ascii="Times New Roman" w:hAnsi="Times New Roman" w:cs="Times New Roman"/>
           <w:color w:val="auto"/>
@@ -8137,7 +8124,7 @@
     </w:p>
     <w:p>
       <w:pPr>
-        <w:pStyle w:val="ListBullet"/>
+        <w:pStyle w:val="a"/>
         <w:rPr>
           <w:rFonts w:ascii="Times New Roman" w:hAnsi="Times New Roman" w:cs="Times New Roman"/>
           <w:color w:val="auto"/>
@@ -8157,7 +8144,7 @@
     </w:p>
     <w:p>
       <w:pPr>
-        <w:pStyle w:val="ListBullet"/>
+        <w:pStyle w:val="a"/>
         <w:rPr>
           <w:rFonts w:ascii="Times New Roman" w:hAnsi="Times New Roman" w:cs="Times New Roman"/>
           <w:color w:val="auto"/>
@@ -8177,7 +8164,7 @@
     </w:p>
     <w:p>
       <w:pPr>
-        <w:pStyle w:val="ListBullet"/>
+        <w:pStyle w:val="a"/>
         <w:rPr>
           <w:rFonts w:ascii="Times New Roman" w:hAnsi="Times New Roman" w:cs="Times New Roman"/>
           <w:color w:val="auto"/>
@@ -8197,7 +8184,7 @@
     </w:p>
     <w:p>
       <w:pPr>
-        <w:pStyle w:val="ListBullet"/>
+        <w:pStyle w:val="a"/>
         <w:rPr>
           <w:rFonts w:ascii="Times New Roman" w:hAnsi="Times New Roman" w:cs="Times New Roman"/>
           <w:color w:val="auto"/>
@@ -8217,7 +8204,7 @@
     </w:p>
     <w:p>
       <w:pPr>
-        <w:pStyle w:val="ListBullet"/>
+        <w:pStyle w:val="a"/>
         <w:rPr>
           <w:rFonts w:ascii="Times New Roman" w:hAnsi="Times New Roman" w:cs="Times New Roman"/>
           <w:color w:val="auto"/>
@@ -8237,18 +8224,18 @@
     </w:p>
     <w:p>
       <w:pPr>
-        <w:pStyle w:val="ListBullet"/>
-        <w:rPr>
-          <w:rFonts w:ascii="Times New Roman" w:hAnsi="Times New Roman" w:cs="Times New Roman"/>
-          <w:color w:val="auto"/>
-          <w:sz w:val="24"/>
-          <w:szCs w:val="24"/>
-        </w:rPr>
-      </w:pPr>
-    </w:p>
-    <w:p>
-      <w:pPr>
-        <w:pStyle w:val="ListBullet"/>
+        <w:pStyle w:val="a"/>
+        <w:rPr>
+          <w:rFonts w:ascii="Times New Roman" w:hAnsi="Times New Roman" w:cs="Times New Roman"/>
+          <w:color w:val="auto"/>
+          <w:sz w:val="24"/>
+          <w:szCs w:val="24"/>
+        </w:rPr>
+      </w:pPr>
+    </w:p>
+    <w:p>
+      <w:pPr>
+        <w:pStyle w:val="a"/>
         <w:rPr>
           <w:rFonts w:ascii="Times New Roman" w:hAnsi="Times New Roman" w:cs="Times New Roman"/>
           <w:color w:val="auto"/>
@@ -8268,7 +8255,7 @@
     </w:p>
     <w:p>
       <w:pPr>
-        <w:pStyle w:val="ListBullet"/>
+        <w:pStyle w:val="a"/>
         <w:rPr>
           <w:rFonts w:ascii="Times New Roman" w:hAnsi="Times New Roman" w:cs="Times New Roman"/>
           <w:color w:val="auto"/>
@@ -8288,7 +8275,7 @@
     </w:p>
     <w:p>
       <w:pPr>
-        <w:pStyle w:val="ListBullet"/>
+        <w:pStyle w:val="a"/>
         <w:rPr>
           <w:rFonts w:ascii="Times New Roman" w:hAnsi="Times New Roman" w:cs="Times New Roman"/>
           <w:color w:val="auto"/>
@@ -8308,7 +8295,7 @@
     </w:p>
     <w:p>
       <w:pPr>
-        <w:pStyle w:val="ListBullet"/>
+        <w:pStyle w:val="a"/>
         <w:rPr>
           <w:rFonts w:ascii="Times New Roman" w:hAnsi="Times New Roman" w:cs="Times New Roman"/>
           <w:color w:val="auto"/>
@@ -8328,7 +8315,7 @@
     </w:p>
     <w:p>
       <w:pPr>
-        <w:pStyle w:val="ListBullet"/>
+        <w:pStyle w:val="a"/>
         <w:rPr>
           <w:rFonts w:ascii="Times New Roman" w:hAnsi="Times New Roman" w:cs="Times New Roman"/>
           <w:color w:val="auto"/>
@@ -8348,7 +8335,7 @@
     </w:p>
     <w:p>
       <w:pPr>
-        <w:pStyle w:val="ListBullet"/>
+        <w:pStyle w:val="a"/>
         <w:rPr>
           <w:rFonts w:ascii="Times New Roman" w:hAnsi="Times New Roman" w:cs="Times New Roman"/>
           <w:color w:val="auto"/>
@@ -8368,18 +8355,18 @@
     </w:p>
     <w:p>
       <w:pPr>
-        <w:pStyle w:val="ListBullet"/>
-        <w:rPr>
-          <w:rFonts w:ascii="Times New Roman" w:hAnsi="Times New Roman" w:cs="Times New Roman"/>
-          <w:color w:val="auto"/>
-          <w:sz w:val="24"/>
-          <w:szCs w:val="24"/>
-        </w:rPr>
-      </w:pPr>
-    </w:p>
-    <w:p>
-      <w:pPr>
-        <w:pStyle w:val="ListBullet"/>
+        <w:pStyle w:val="a"/>
+        <w:rPr>
+          <w:rFonts w:ascii="Times New Roman" w:hAnsi="Times New Roman" w:cs="Times New Roman"/>
+          <w:color w:val="auto"/>
+          <w:sz w:val="24"/>
+          <w:szCs w:val="24"/>
+        </w:rPr>
+      </w:pPr>
+    </w:p>
+    <w:p>
+      <w:pPr>
+        <w:pStyle w:val="a"/>
         <w:rPr>
           <w:rFonts w:ascii="Times New Roman" w:hAnsi="Times New Roman" w:cs="Times New Roman"/>
           <w:color w:val="auto"/>
@@ -8399,7 +8386,7 @@
     </w:p>
     <w:p>
       <w:pPr>
-        <w:pStyle w:val="ListBullet"/>
+        <w:pStyle w:val="a"/>
         <w:rPr>
           <w:rFonts w:ascii="Times New Roman" w:hAnsi="Times New Roman" w:cs="Times New Roman"/>
           <w:color w:val="auto"/>
@@ -8419,7 +8406,7 @@
     </w:p>
     <w:p>
       <w:pPr>
-        <w:pStyle w:val="ListBullet"/>
+        <w:pStyle w:val="a"/>
         <w:rPr>
           <w:rFonts w:ascii="Times New Roman" w:hAnsi="Times New Roman" w:cs="Times New Roman"/>
           <w:color w:val="auto"/>
@@ -8439,7 +8426,7 @@
     </w:p>
     <w:p>
       <w:pPr>
-        <w:pStyle w:val="ListBullet"/>
+        <w:pStyle w:val="a"/>
         <w:rPr>
           <w:rFonts w:ascii="Times New Roman" w:hAnsi="Times New Roman" w:cs="Times New Roman"/>
           <w:color w:val="auto"/>
@@ -8459,7 +8446,7 @@
     </w:p>
     <w:p>
       <w:pPr>
-        <w:pStyle w:val="ListBullet"/>
+        <w:pStyle w:val="a"/>
         <w:rPr>
           <w:rFonts w:ascii="Times New Roman" w:hAnsi="Times New Roman" w:cs="Times New Roman"/>
           <w:color w:val="auto"/>
@@ -8479,7 +8466,7 @@
     </w:p>
     <w:p>
       <w:pPr>
-        <w:pStyle w:val="ListBullet"/>
+        <w:pStyle w:val="a"/>
         <w:rPr>
           <w:rFonts w:ascii="Times New Roman" w:hAnsi="Times New Roman" w:cs="Times New Roman"/>
           <w:color w:val="auto"/>
@@ -8499,7 +8486,7 @@
     </w:p>
     <w:p>
       <w:pPr>
-        <w:pStyle w:val="ListBullet"/>
+        <w:pStyle w:val="a"/>
         <w:rPr>
           <w:rFonts w:ascii="Times New Roman" w:hAnsi="Times New Roman" w:cs="Times New Roman"/>
           <w:color w:val="auto"/>
@@ -8519,7 +8506,7 @@
     </w:p>
     <w:p>
       <w:pPr>
-        <w:pStyle w:val="ListBullet"/>
+        <w:pStyle w:val="a"/>
         <w:rPr>
           <w:rFonts w:ascii="Times New Roman" w:hAnsi="Times New Roman" w:cs="Times New Roman"/>
           <w:color w:val="auto"/>
@@ -8539,7 +8526,7 @@
     </w:p>
     <w:p>
       <w:pPr>
-        <w:pStyle w:val="ListBullet"/>
+        <w:pStyle w:val="a"/>
         <w:rPr>
           <w:rFonts w:ascii="Times New Roman" w:hAnsi="Times New Roman" w:cs="Times New Roman"/>
           <w:color w:val="auto"/>
@@ -8559,18 +8546,18 @@
     </w:p>
     <w:p>
       <w:pPr>
-        <w:pStyle w:val="ListBullet"/>
-        <w:rPr>
-          <w:rFonts w:ascii="Times New Roman" w:hAnsi="Times New Roman" w:cs="Times New Roman"/>
-          <w:color w:val="auto"/>
-          <w:sz w:val="24"/>
-          <w:szCs w:val="24"/>
-        </w:rPr>
-      </w:pPr>
-    </w:p>
-    <w:p>
-      <w:pPr>
-        <w:pStyle w:val="ListBullet"/>
+        <w:pStyle w:val="a"/>
+        <w:rPr>
+          <w:rFonts w:ascii="Times New Roman" w:hAnsi="Times New Roman" w:cs="Times New Roman"/>
+          <w:color w:val="auto"/>
+          <w:sz w:val="24"/>
+          <w:szCs w:val="24"/>
+        </w:rPr>
+      </w:pPr>
+    </w:p>
+    <w:p>
+      <w:pPr>
+        <w:pStyle w:val="a"/>
         <w:rPr>
           <w:rFonts w:ascii="Times New Roman" w:hAnsi="Times New Roman" w:cs="Times New Roman"/>
           <w:color w:val="auto"/>
@@ -8590,7 +8577,7 @@
     </w:p>
     <w:p>
       <w:pPr>
-        <w:pStyle w:val="ListBullet"/>
+        <w:pStyle w:val="a"/>
         <w:rPr>
           <w:rFonts w:ascii="Times New Roman" w:hAnsi="Times New Roman" w:cs="Times New Roman"/>
           <w:color w:val="auto"/>
@@ -8610,7 +8597,7 @@
     </w:p>
     <w:p>
       <w:pPr>
-        <w:pStyle w:val="ListBullet"/>
+        <w:pStyle w:val="a"/>
         <w:rPr>
           <w:rFonts w:ascii="Times New Roman" w:hAnsi="Times New Roman" w:cs="Times New Roman"/>
           <w:color w:val="auto"/>
@@ -8630,7 +8617,7 @@
     </w:p>
     <w:p>
       <w:pPr>
-        <w:pStyle w:val="ListBullet"/>
+        <w:pStyle w:val="a"/>
         <w:rPr>
           <w:rFonts w:ascii="Times New Roman" w:hAnsi="Times New Roman" w:cs="Times New Roman"/>
           <w:color w:val="auto"/>
@@ -8650,7 +8637,7 @@
     </w:p>
     <w:p>
       <w:pPr>
-        <w:pStyle w:val="ListBullet"/>
+        <w:pStyle w:val="a"/>
         <w:rPr>
           <w:rFonts w:ascii="Times New Roman" w:hAnsi="Times New Roman" w:cs="Times New Roman"/>
           <w:color w:val="auto"/>
@@ -8670,7 +8657,7 @@
     </w:p>
     <w:p>
       <w:pPr>
-        <w:pStyle w:val="ListBullet"/>
+        <w:pStyle w:val="a"/>
         <w:rPr>
           <w:rFonts w:ascii="Times New Roman" w:hAnsi="Times New Roman" w:cs="Times New Roman"/>
           <w:color w:val="auto"/>
@@ -8690,7 +8677,7 @@
     </w:p>
     <w:p>
       <w:pPr>
-        <w:pStyle w:val="ListBullet"/>
+        <w:pStyle w:val="a"/>
         <w:rPr>
           <w:rFonts w:ascii="Times New Roman" w:hAnsi="Times New Roman" w:cs="Times New Roman"/>
           <w:color w:val="auto"/>
@@ -8710,7 +8697,7 @@
     </w:p>
     <w:p>
       <w:pPr>
-        <w:pStyle w:val="ListBullet"/>
+        <w:pStyle w:val="a"/>
         <w:rPr>
           <w:rFonts w:ascii="Times New Roman" w:hAnsi="Times New Roman" w:cs="Times New Roman"/>
           <w:color w:val="auto"/>
@@ -8730,7 +8717,7 @@
     </w:p>
     <w:p>
       <w:pPr>
-        <w:pStyle w:val="ListBullet"/>
+        <w:pStyle w:val="a"/>
         <w:rPr>
           <w:rFonts w:ascii="Times New Roman" w:hAnsi="Times New Roman" w:cs="Times New Roman"/>
           <w:color w:val="auto"/>
@@ -8750,7 +8737,7 @@
     </w:p>
     <w:p>
       <w:pPr>
-        <w:pStyle w:val="ListBullet"/>
+        <w:pStyle w:val="a"/>
         <w:rPr>
           <w:rFonts w:ascii="Times New Roman" w:hAnsi="Times New Roman" w:cs="Times New Roman"/>
           <w:color w:val="auto"/>
@@ -8770,7 +8757,7 @@
     </w:p>
     <w:p>
       <w:pPr>
-        <w:pStyle w:val="ListBullet"/>
+        <w:pStyle w:val="a"/>
         <w:rPr>
           <w:rFonts w:ascii="Times New Roman" w:hAnsi="Times New Roman" w:cs="Times New Roman"/>
           <w:color w:val="auto"/>
@@ -8790,7 +8777,7 @@
     </w:p>
     <w:p>
       <w:pPr>
-        <w:pStyle w:val="ListBullet"/>
+        <w:pStyle w:val="a"/>
         <w:rPr>
           <w:rFonts w:ascii="Times New Roman" w:hAnsi="Times New Roman" w:cs="Times New Roman"/>
           <w:color w:val="auto"/>
@@ -8810,7 +8797,7 @@
     </w:p>
     <w:p>
       <w:pPr>
-        <w:pStyle w:val="ListBullet"/>
+        <w:pStyle w:val="a"/>
         <w:rPr>
           <w:rFonts w:ascii="Times New Roman" w:hAnsi="Times New Roman" w:cs="Times New Roman"/>
           <w:color w:val="auto"/>
@@ -8830,18 +8817,18 @@
     </w:p>
     <w:p>
       <w:pPr>
-        <w:pStyle w:val="ListBullet"/>
-        <w:rPr>
-          <w:rFonts w:ascii="Times New Roman" w:hAnsi="Times New Roman" w:cs="Times New Roman"/>
-          <w:color w:val="auto"/>
-          <w:sz w:val="24"/>
-          <w:szCs w:val="24"/>
-        </w:rPr>
-      </w:pPr>
-    </w:p>
-    <w:p>
-      <w:pPr>
-        <w:pStyle w:val="ListBullet"/>
+        <w:pStyle w:val="a"/>
+        <w:rPr>
+          <w:rFonts w:ascii="Times New Roman" w:hAnsi="Times New Roman" w:cs="Times New Roman"/>
+          <w:color w:val="auto"/>
+          <w:sz w:val="24"/>
+          <w:szCs w:val="24"/>
+        </w:rPr>
+      </w:pPr>
+    </w:p>
+    <w:p>
+      <w:pPr>
+        <w:pStyle w:val="a"/>
         <w:rPr>
           <w:rFonts w:ascii="Times New Roman" w:hAnsi="Times New Roman" w:cs="Times New Roman"/>
           <w:color w:val="auto"/>
@@ -8861,7 +8848,7 @@
     </w:p>
     <w:p>
       <w:pPr>
-        <w:pStyle w:val="ListBullet"/>
+        <w:pStyle w:val="a"/>
         <w:rPr>
           <w:rFonts w:ascii="Times New Roman" w:hAnsi="Times New Roman" w:cs="Times New Roman"/>
           <w:color w:val="auto"/>
@@ -8881,7 +8868,7 @@
     </w:p>
     <w:p>
       <w:pPr>
-        <w:pStyle w:val="ListBullet"/>
+        <w:pStyle w:val="a"/>
         <w:rPr>
           <w:rFonts w:ascii="Times New Roman" w:hAnsi="Times New Roman" w:cs="Times New Roman"/>
           <w:color w:val="auto"/>
@@ -8901,7 +8888,7 @@
     </w:p>
     <w:p>
       <w:pPr>
-        <w:pStyle w:val="ListBullet"/>
+        <w:pStyle w:val="a"/>
         <w:rPr>
           <w:rFonts w:ascii="Times New Roman" w:hAnsi="Times New Roman" w:cs="Times New Roman"/>
           <w:color w:val="auto"/>
@@ -8921,7 +8908,7 @@
     </w:p>
     <w:p>
       <w:pPr>
-        <w:pStyle w:val="ListBullet"/>
+        <w:pStyle w:val="a"/>
         <w:rPr>
           <w:rFonts w:ascii="Times New Roman" w:hAnsi="Times New Roman" w:cs="Times New Roman"/>
           <w:color w:val="auto"/>
@@ -8941,7 +8928,7 @@
     </w:p>
     <w:p>
       <w:pPr>
-        <w:pStyle w:val="ListBullet"/>
+        <w:pStyle w:val="a"/>
         <w:rPr>
           <w:rFonts w:ascii="Times New Roman" w:hAnsi="Times New Roman" w:cs="Times New Roman"/>
           <w:color w:val="auto"/>
@@ -8961,7 +8948,7 @@
     </w:p>
     <w:p>
       <w:pPr>
-        <w:pStyle w:val="ListBullet"/>
+        <w:pStyle w:val="a"/>
         <w:rPr>
           <w:rFonts w:ascii="Times New Roman" w:hAnsi="Times New Roman" w:cs="Times New Roman"/>
           <w:color w:val="auto"/>
@@ -8981,7 +8968,7 @@
     </w:p>
     <w:p>
       <w:pPr>
-        <w:pStyle w:val="ListBullet"/>
+        <w:pStyle w:val="a"/>
         <w:rPr>
           <w:rFonts w:ascii="Times New Roman" w:hAnsi="Times New Roman" w:cs="Times New Roman"/>
           <w:color w:val="auto"/>
@@ -9001,7 +8988,7 @@
     </w:p>
     <w:p>
       <w:pPr>
-        <w:pStyle w:val="ListBullet"/>
+        <w:pStyle w:val="a"/>
         <w:rPr>
           <w:rFonts w:ascii="Times New Roman" w:hAnsi="Times New Roman" w:cs="Times New Roman"/>
           <w:color w:val="auto"/>
@@ -9021,7 +9008,7 @@
     </w:p>
     <w:p>
       <w:pPr>
-        <w:pStyle w:val="ListBullet"/>
+        <w:pStyle w:val="a"/>
         <w:rPr>
           <w:rFonts w:ascii="Times New Roman" w:hAnsi="Times New Roman" w:cs="Times New Roman"/>
           <w:color w:val="auto"/>
@@ -9041,7 +9028,7 @@
     </w:p>
     <w:p>
       <w:pPr>
-        <w:pStyle w:val="ListBullet"/>
+        <w:pStyle w:val="a"/>
         <w:rPr>
           <w:rFonts w:ascii="Times New Roman" w:hAnsi="Times New Roman" w:cs="Times New Roman"/>
           <w:color w:val="auto"/>
@@ -9061,7 +9048,7 @@
     </w:p>
     <w:p>
       <w:pPr>
-        <w:pStyle w:val="ListBullet"/>
+        <w:pStyle w:val="a"/>
         <w:rPr>
           <w:rFonts w:ascii="Times New Roman" w:hAnsi="Times New Roman" w:cs="Times New Roman"/>
           <w:color w:val="auto"/>
@@ -9081,18 +9068,18 @@
     </w:p>
     <w:p>
       <w:pPr>
-        <w:pStyle w:val="ListBullet"/>
-        <w:rPr>
-          <w:rFonts w:ascii="Times New Roman" w:hAnsi="Times New Roman" w:cs="Times New Roman"/>
-          <w:color w:val="auto"/>
-          <w:sz w:val="24"/>
-          <w:szCs w:val="24"/>
-        </w:rPr>
-      </w:pPr>
-    </w:p>
-    <w:p>
-      <w:pPr>
-        <w:pStyle w:val="ListBullet"/>
+        <w:pStyle w:val="a"/>
+        <w:rPr>
+          <w:rFonts w:ascii="Times New Roman" w:hAnsi="Times New Roman" w:cs="Times New Roman"/>
+          <w:color w:val="auto"/>
+          <w:sz w:val="24"/>
+          <w:szCs w:val="24"/>
+        </w:rPr>
+      </w:pPr>
+    </w:p>
+    <w:p>
+      <w:pPr>
+        <w:pStyle w:val="a"/>
         <w:rPr>
           <w:rFonts w:ascii="Times New Roman" w:hAnsi="Times New Roman" w:cs="Times New Roman"/>
           <w:color w:val="auto"/>
@@ -9112,7 +9099,7 @@
     </w:p>
     <w:p>
       <w:pPr>
-        <w:pStyle w:val="ListBullet"/>
+        <w:pStyle w:val="a"/>
         <w:rPr>
           <w:rFonts w:ascii="Times New Roman" w:hAnsi="Times New Roman" w:cs="Times New Roman"/>
           <w:color w:val="auto"/>
@@ -9132,7 +9119,7 @@
     </w:p>
     <w:p>
       <w:pPr>
-        <w:pStyle w:val="ListBullet"/>
+        <w:pStyle w:val="a"/>
         <w:rPr>
           <w:rFonts w:ascii="Times New Roman" w:hAnsi="Times New Roman" w:cs="Times New Roman"/>
           <w:color w:val="auto"/>
@@ -9152,7 +9139,7 @@
     </w:p>
     <w:p>
       <w:pPr>
-        <w:pStyle w:val="ListBullet"/>
+        <w:pStyle w:val="a"/>
         <w:rPr>
           <w:rFonts w:ascii="Times New Roman" w:hAnsi="Times New Roman" w:cs="Times New Roman"/>
           <w:color w:val="auto"/>
@@ -9172,7 +9159,7 @@
     </w:p>
     <w:p>
       <w:pPr>
-        <w:pStyle w:val="ListBullet"/>
+        <w:pStyle w:val="a"/>
         <w:rPr>
           <w:rFonts w:ascii="Times New Roman" w:hAnsi="Times New Roman" w:cs="Times New Roman"/>
           <w:color w:val="auto"/>
@@ -9192,7 +9179,7 @@
     </w:p>
     <w:p>
       <w:pPr>
-        <w:pStyle w:val="ListBullet"/>
+        <w:pStyle w:val="a"/>
         <w:rPr>
           <w:rFonts w:ascii="Times New Roman" w:hAnsi="Times New Roman" w:cs="Times New Roman"/>
           <w:color w:val="auto"/>
@@ -9212,7 +9199,7 @@
     </w:p>
     <w:p>
       <w:pPr>
-        <w:pStyle w:val="ListBullet"/>
+        <w:pStyle w:val="a"/>
         <w:rPr>
           <w:rFonts w:ascii="Times New Roman" w:hAnsi="Times New Roman" w:cs="Times New Roman"/>
           <w:color w:val="auto"/>
@@ -9232,18 +9219,18 @@
     </w:p>
     <w:p>
       <w:pPr>
-        <w:pStyle w:val="ListBullet"/>
-        <w:rPr>
-          <w:rFonts w:ascii="Times New Roman" w:hAnsi="Times New Roman" w:cs="Times New Roman"/>
-          <w:color w:val="auto"/>
-          <w:sz w:val="24"/>
-          <w:szCs w:val="24"/>
-        </w:rPr>
-      </w:pPr>
-    </w:p>
-    <w:p>
-      <w:pPr>
-        <w:pStyle w:val="ListBullet"/>
+        <w:pStyle w:val="a"/>
+        <w:rPr>
+          <w:rFonts w:ascii="Times New Roman" w:hAnsi="Times New Roman" w:cs="Times New Roman"/>
+          <w:color w:val="auto"/>
+          <w:sz w:val="24"/>
+          <w:szCs w:val="24"/>
+        </w:rPr>
+      </w:pPr>
+    </w:p>
+    <w:p>
+      <w:pPr>
+        <w:pStyle w:val="a"/>
         <w:rPr>
           <w:rFonts w:ascii="Times New Roman" w:hAnsi="Times New Roman" w:cs="Times New Roman"/>
           <w:color w:val="auto"/>
@@ -9263,7 +9250,7 @@
     </w:p>
     <w:p>
       <w:pPr>
-        <w:pStyle w:val="ListBullet"/>
+        <w:pStyle w:val="a"/>
         <w:rPr>
           <w:rFonts w:ascii="Times New Roman" w:hAnsi="Times New Roman" w:cs="Times New Roman"/>
           <w:color w:val="auto"/>
@@ -9283,7 +9270,7 @@
     </w:p>
     <w:p>
       <w:pPr>
-        <w:pStyle w:val="ListBullet"/>
+        <w:pStyle w:val="a"/>
         <w:rPr>
           <w:rFonts w:ascii="Times New Roman" w:hAnsi="Times New Roman" w:cs="Times New Roman"/>
           <w:color w:val="auto"/>
@@ -9303,7 +9290,7 @@
     </w:p>
     <w:p>
       <w:pPr>
-        <w:pStyle w:val="ListBullet"/>
+        <w:pStyle w:val="a"/>
         <w:rPr>
           <w:rFonts w:ascii="Times New Roman" w:hAnsi="Times New Roman" w:cs="Times New Roman"/>
           <w:color w:val="auto"/>
@@ -9323,7 +9310,7 @@
     </w:p>
     <w:p>
       <w:pPr>
-        <w:pStyle w:val="ListBullet"/>
+        <w:pStyle w:val="a"/>
         <w:rPr>
           <w:rFonts w:ascii="Times New Roman" w:hAnsi="Times New Roman" w:cs="Times New Roman"/>
           <w:color w:val="auto"/>
@@ -9343,7 +9330,7 @@
     </w:p>
     <w:p>
       <w:pPr>
-        <w:pStyle w:val="ListBullet"/>
+        <w:pStyle w:val="a"/>
         <w:rPr>
           <w:rFonts w:ascii="Times New Roman" w:hAnsi="Times New Roman" w:cs="Times New Roman"/>
           <w:color w:val="auto"/>
@@ -9363,7 +9350,7 @@
     </w:p>
     <w:p>
       <w:pPr>
-        <w:pStyle w:val="ListBullet"/>
+        <w:pStyle w:val="a"/>
         <w:rPr>
           <w:rFonts w:ascii="Times New Roman" w:hAnsi="Times New Roman" w:cs="Times New Roman"/>
           <w:color w:val="auto"/>
@@ -9383,7 +9370,7 @@
     </w:p>
     <w:p>
       <w:pPr>
-        <w:pStyle w:val="ListBullet"/>
+        <w:pStyle w:val="a"/>
         <w:rPr>
           <w:rFonts w:ascii="Times New Roman" w:hAnsi="Times New Roman" w:cs="Times New Roman"/>
           <w:color w:val="auto"/>
@@ -9403,7 +9390,7 @@
     </w:p>
     <w:p>
       <w:pPr>
-        <w:pStyle w:val="ListBullet"/>
+        <w:pStyle w:val="a"/>
         <w:rPr>
           <w:rFonts w:ascii="Times New Roman" w:hAnsi="Times New Roman" w:cs="Times New Roman"/>
           <w:color w:val="auto"/>
@@ -9423,7 +9410,7 @@
     </w:p>
     <w:p>
       <w:pPr>
-        <w:pStyle w:val="ListBullet"/>
+        <w:pStyle w:val="a"/>
         <w:rPr>
           <w:rFonts w:ascii="Times New Roman" w:hAnsi="Times New Roman" w:cs="Times New Roman"/>
           <w:color w:val="auto"/>
@@ -9444,18 +9431,18 @@
     </w:p>
     <w:p>
       <w:pPr>
-        <w:pStyle w:val="ListBullet"/>
-        <w:rPr>
-          <w:rFonts w:ascii="Times New Roman" w:hAnsi="Times New Roman" w:cs="Times New Roman"/>
-          <w:color w:val="auto"/>
-          <w:sz w:val="24"/>
-          <w:szCs w:val="24"/>
-        </w:rPr>
-      </w:pPr>
-    </w:p>
-    <w:p>
-      <w:pPr>
-        <w:pStyle w:val="ListBullet"/>
+        <w:pStyle w:val="a"/>
+        <w:rPr>
+          <w:rFonts w:ascii="Times New Roman" w:hAnsi="Times New Roman" w:cs="Times New Roman"/>
+          <w:color w:val="auto"/>
+          <w:sz w:val="24"/>
+          <w:szCs w:val="24"/>
+        </w:rPr>
+      </w:pPr>
+    </w:p>
+    <w:p>
+      <w:pPr>
+        <w:pStyle w:val="a"/>
         <w:rPr>
           <w:rFonts w:ascii="Times New Roman" w:hAnsi="Times New Roman" w:cs="Times New Roman"/>
           <w:color w:val="auto"/>
@@ -9475,7 +9462,7 @@
     </w:p>
     <w:p>
       <w:pPr>
-        <w:pStyle w:val="ListBullet"/>
+        <w:pStyle w:val="a"/>
         <w:rPr>
           <w:rFonts w:ascii="Times New Roman" w:hAnsi="Times New Roman" w:cs="Times New Roman"/>
           <w:color w:val="auto"/>
@@ -9495,7 +9482,7 @@
     </w:p>
     <w:p>
       <w:pPr>
-        <w:pStyle w:val="ListBullet"/>
+        <w:pStyle w:val="a"/>
         <w:rPr>
           <w:rFonts w:ascii="Times New Roman" w:hAnsi="Times New Roman" w:cs="Times New Roman"/>
           <w:color w:val="auto"/>
@@ -9515,7 +9502,7 @@
     </w:p>
     <w:p>
       <w:pPr>
-        <w:pStyle w:val="ListBullet"/>
+        <w:pStyle w:val="a"/>
         <w:rPr>
           <w:rFonts w:ascii="Times New Roman" w:hAnsi="Times New Roman" w:cs="Times New Roman"/>
           <w:color w:val="auto"/>
@@ -9535,7 +9522,7 @@
     </w:p>
     <w:p>
       <w:pPr>
-        <w:pStyle w:val="ListBullet"/>
+        <w:pStyle w:val="a"/>
         <w:rPr>
           <w:rFonts w:ascii="Times New Roman" w:hAnsi="Times New Roman" w:cs="Times New Roman"/>
           <w:color w:val="auto"/>
@@ -9555,7 +9542,7 @@
     </w:p>
     <w:p>
       <w:pPr>
-        <w:pStyle w:val="ListBullet"/>
+        <w:pStyle w:val="a"/>
         <w:rPr>
           <w:rFonts w:ascii="Times New Roman" w:hAnsi="Times New Roman" w:cs="Times New Roman"/>
           <w:color w:val="auto"/>
@@ -9575,7 +9562,7 @@
     </w:p>
     <w:p>
       <w:pPr>
-        <w:pStyle w:val="ListBullet"/>
+        <w:pStyle w:val="a"/>
         <w:rPr>
           <w:rFonts w:ascii="Times New Roman" w:hAnsi="Times New Roman" w:cs="Times New Roman"/>
           <w:color w:val="auto"/>
@@ -9595,7 +9582,7 @@
     </w:p>
     <w:p>
       <w:pPr>
-        <w:pStyle w:val="ListBullet"/>
+        <w:pStyle w:val="a"/>
         <w:rPr>
           <w:rFonts w:ascii="Times New Roman" w:hAnsi="Times New Roman" w:cs="Times New Roman"/>
           <w:color w:val="auto"/>
@@ -9615,7 +9602,7 @@
     </w:p>
     <w:p>
       <w:pPr>
-        <w:pStyle w:val="ListBullet"/>
+        <w:pStyle w:val="a"/>
         <w:rPr>
           <w:rFonts w:ascii="Times New Roman" w:hAnsi="Times New Roman" w:cs="Times New Roman"/>
           <w:color w:val="auto"/>
@@ -9635,7 +9622,7 @@
     </w:p>
     <w:p>
       <w:pPr>
-        <w:pStyle w:val="ListBullet"/>
+        <w:pStyle w:val="a"/>
         <w:rPr>
           <w:rFonts w:ascii="Times New Roman" w:hAnsi="Times New Roman" w:cs="Times New Roman"/>
           <w:color w:val="auto"/>
@@ -9655,7 +9642,7 @@
     </w:p>
     <w:p>
       <w:pPr>
-        <w:pStyle w:val="ListBullet"/>
+        <w:pStyle w:val="a"/>
         <w:rPr>
           <w:rFonts w:ascii="Times New Roman" w:hAnsi="Times New Roman" w:cs="Times New Roman"/>
           <w:color w:val="auto"/>
@@ -9675,7 +9662,7 @@
     </w:p>
     <w:p>
       <w:pPr>
-        <w:pStyle w:val="ListBullet"/>
+        <w:pStyle w:val="a"/>
         <w:rPr>
           <w:rFonts w:ascii="Times New Roman" w:hAnsi="Times New Roman" w:cs="Times New Roman"/>
           <w:color w:val="auto"/>
@@ -9695,7 +9682,7 @@
     </w:p>
     <w:p>
       <w:pPr>
-        <w:pStyle w:val="ListBullet"/>
+        <w:pStyle w:val="a"/>
         <w:rPr>
           <w:rFonts w:ascii="Times New Roman" w:hAnsi="Times New Roman" w:cs="Times New Roman"/>
           <w:color w:val="auto"/>
@@ -9715,7 +9702,7 @@
     </w:p>
     <w:p>
       <w:pPr>
-        <w:pStyle w:val="ListBullet"/>
+        <w:pStyle w:val="a"/>
         <w:rPr>
           <w:rFonts w:ascii="Times New Roman" w:hAnsi="Times New Roman" w:cs="Times New Roman"/>
           <w:color w:val="auto"/>
@@ -9735,7 +9722,7 @@
     </w:p>
     <w:p>
       <w:pPr>
-        <w:pStyle w:val="ListBullet"/>
+        <w:pStyle w:val="a"/>
         <w:numPr>
           <w:ilvl w:val="0"/>
           <w:numId w:val="0"/>
@@ -9760,7 +9747,7 @@
     </w:p>
     <w:p>
       <w:pPr>
-        <w:pStyle w:val="ListBullet"/>
+        <w:pStyle w:val="a"/>
         <w:numPr>
           <w:ilvl w:val="0"/>
           <w:numId w:val="0"/>
@@ -9776,7 +9763,7 @@
     </w:p>
     <w:p>
       <w:pPr>
-        <w:pStyle w:val="ListBullet"/>
+        <w:pStyle w:val="a"/>
         <w:numPr>
           <w:ilvl w:val="0"/>
           <w:numId w:val="0"/>
@@ -9801,7 +9788,7 @@
     </w:p>
     <w:p>
       <w:pPr>
-        <w:pStyle w:val="ListBullet"/>
+        <w:pStyle w:val="a"/>
         <w:numPr>
           <w:ilvl w:val="0"/>
           <w:numId w:val="0"/>
@@ -9861,7 +9848,7 @@
     </w:p>
     <w:p>
       <w:pPr>
-        <w:pStyle w:val="ListBullet"/>
+        <w:pStyle w:val="a"/>
         <w:numPr>
           <w:ilvl w:val="0"/>
           <w:numId w:val="0"/>
@@ -9877,7 +9864,7 @@
     </w:p>
     <w:p>
       <w:pPr>
-        <w:pStyle w:val="ListBullet"/>
+        <w:pStyle w:val="a"/>
         <w:numPr>
           <w:ilvl w:val="0"/>
           <w:numId w:val="0"/>
@@ -9892,7 +9879,7 @@
     </w:p>
     <w:p>
       <w:pPr>
-        <w:pStyle w:val="ListBullet"/>
+        <w:pStyle w:val="a"/>
         <w:numPr>
           <w:ilvl w:val="0"/>
           <w:numId w:val="0"/>
@@ -9922,7 +9909,7 @@
     </w:p>
     <w:p>
       <w:pPr>
-        <w:pStyle w:val="ListBullet"/>
+        <w:pStyle w:val="a"/>
         <w:numPr>
           <w:ilvl w:val="0"/>
           <w:numId w:val="0"/>
@@ -9979,7 +9966,7 @@
     </w:p>
     <w:p>
       <w:pPr>
-        <w:pStyle w:val="ListBullet"/>
+        <w:pStyle w:val="a"/>
         <w:numPr>
           <w:ilvl w:val="0"/>
           <w:numId w:val="0"/>
@@ -10023,7 +10010,7 @@
     </w:p>
     <w:p>
       <w:pPr>
-        <w:pStyle w:val="ListBullet"/>
+        <w:pStyle w:val="a"/>
         <w:numPr>
           <w:ilvl w:val="0"/>
           <w:numId w:val="0"/>
@@ -10049,18 +10036,26 @@
           <w:szCs w:val="32"/>
         </w:rPr>
         <w:drawing>
-          <wp:anchor distT="0" distB="0" distL="114300" distR="114300" simplePos="0" relativeHeight="251686912" behindDoc="0" locked="0" layoutInCell="1" allowOverlap="1" wp14:anchorId="0C88C998" wp14:editId="6F439CB8">
+          <wp:anchor distT="0" distB="0" distL="114300" distR="114300" simplePos="0" relativeHeight="251684864" behindDoc="0" locked="0" layoutInCell="1" allowOverlap="1" wp14:anchorId="65AE1C80" wp14:editId="662B996F">
             <wp:simplePos x="0" y="0"/>
             <wp:positionH relativeFrom="margin">
               <wp:align>right</wp:align>
             </wp:positionH>
             <wp:positionV relativeFrom="paragraph">
-              <wp:posOffset>2975536</wp:posOffset>
+              <wp:posOffset>295275</wp:posOffset>
             </wp:positionV>
-            <wp:extent cx="3476625" cy="2051685"/>
-            <wp:effectExtent l="0" t="0" r="9525" b="5715"/>
-            <wp:wrapSquare wrapText="bothSides"/>
-            <wp:docPr id="1831342316" name="صورة 14"/>
+            <wp:extent cx="5349240" cy="4968240"/>
+            <wp:effectExtent l="0" t="0" r="3810" b="3810"/>
+            <wp:wrapThrough wrapText="bothSides">
+              <wp:wrapPolygon edited="0">
+                <wp:start x="0" y="0"/>
+                <wp:lineTo x="0" y="21534"/>
+                <wp:lineTo x="21538" y="21534"/>
+                <wp:lineTo x="21538" y="0"/>
+                <wp:lineTo x="0" y="0"/>
+              </wp:wrapPolygon>
+            </wp:wrapThrough>
+            <wp:docPr id="1698535980" name="صورة 12"/>
             <wp:cNvGraphicFramePr>
               <a:graphicFrameLocks xmlns:a="http://schemas.openxmlformats.org/drawingml/2006/main" noChangeAspect="1"/>
             </wp:cNvGraphicFramePr>
@@ -10068,7 +10063,7 @@
               <a:graphicData uri="http://schemas.openxmlformats.org/drawingml/2006/picture">
                 <pic:pic xmlns:pic="http://schemas.openxmlformats.org/drawingml/2006/picture">
                   <pic:nvPicPr>
-                    <pic:cNvPr id="1831342316" name="صورة 1831342316"/>
+                    <pic:cNvPr id="1698535980" name="صورة 1698535980"/>
                     <pic:cNvPicPr/>
                   </pic:nvPicPr>
                   <pic:blipFill>
@@ -10080,7 +10075,7 @@
                   <pic:spPr>
                     <a:xfrm>
                       <a:off x="0" y="0"/>
-                      <a:ext cx="3476625" cy="2051685"/>
+                      <a:ext cx="5349240" cy="4968240"/>
                     </a:xfrm>
                     <a:prstGeom prst="rect">
                       <a:avLst/>
@@ -10107,132 +10102,12 @@
           <w:sz w:val="32"/>
           <w:szCs w:val="32"/>
         </w:rPr>
-        <w:t>2.3 Output Results (Screenshots of Tables)</w:t>
-      </w:r>
-      <w:r>
-        <w:rPr>
-          <w:rFonts w:ascii="Times New Roman" w:hAnsi="Times New Roman" w:cs="Times New Roman"/>
-          <w:b/>
-          <w:bCs/>
-          <w:noProof/>
-          <w:color w:val="auto"/>
-          <w:sz w:val="32"/>
-          <w:szCs w:val="32"/>
-        </w:rPr>
-        <w:drawing>
-          <wp:anchor distT="0" distB="0" distL="114300" distR="114300" simplePos="0" relativeHeight="251684864" behindDoc="0" locked="0" layoutInCell="1" allowOverlap="1" wp14:anchorId="321BB95D" wp14:editId="5E5F1877">
-            <wp:simplePos x="0" y="0"/>
-            <wp:positionH relativeFrom="page">
-              <wp:align>right</wp:align>
-            </wp:positionH>
-            <wp:positionV relativeFrom="paragraph">
-              <wp:posOffset>658938</wp:posOffset>
-            </wp:positionV>
-            <wp:extent cx="3976370" cy="2317750"/>
-            <wp:effectExtent l="0" t="0" r="5080" b="6350"/>
-            <wp:wrapSquare wrapText="bothSides"/>
-            <wp:docPr id="269554441" name="صورة 12"/>
-            <wp:cNvGraphicFramePr>
-              <a:graphicFrameLocks xmlns:a="http://schemas.openxmlformats.org/drawingml/2006/main" noChangeAspect="1"/>
-            </wp:cNvGraphicFramePr>
-            <a:graphic xmlns:a="http://schemas.openxmlformats.org/drawingml/2006/main">
-              <a:graphicData uri="http://schemas.openxmlformats.org/drawingml/2006/picture">
-                <pic:pic xmlns:pic="http://schemas.openxmlformats.org/drawingml/2006/picture">
-                  <pic:nvPicPr>
-                    <pic:cNvPr id="269554441" name="صورة 269554441"/>
-                    <pic:cNvPicPr/>
-                  </pic:nvPicPr>
-                  <pic:blipFill>
-                    <a:blip r:embed="rId18"/>
-                    <a:stretch>
-                      <a:fillRect/>
-                    </a:stretch>
-                  </pic:blipFill>
-                  <pic:spPr>
-                    <a:xfrm>
-                      <a:off x="0" y="0"/>
-                      <a:ext cx="3976370" cy="2317750"/>
-                    </a:xfrm>
-                    <a:prstGeom prst="rect">
-                      <a:avLst/>
-                    </a:prstGeom>
-                  </pic:spPr>
-                </pic:pic>
-              </a:graphicData>
-            </a:graphic>
-            <wp14:sizeRelH relativeFrom="margin">
-              <wp14:pctWidth>0</wp14:pctWidth>
-            </wp14:sizeRelH>
-            <wp14:sizeRelV relativeFrom="margin">
-              <wp14:pctHeight>0</wp14:pctHeight>
-            </wp14:sizeRelV>
-          </wp:anchor>
-        </w:drawing>
-      </w:r>
-      <w:r>
-        <w:rPr>
-          <w:rFonts w:ascii="Times New Roman" w:hAnsi="Times New Roman" w:cs="Times New Roman"/>
-          <w:b/>
-          <w:bCs/>
-          <w:noProof/>
-          <w:color w:val="auto"/>
-          <w:sz w:val="32"/>
-          <w:szCs w:val="32"/>
-        </w:rPr>
-        <w:drawing>
-          <wp:anchor distT="0" distB="0" distL="114300" distR="114300" simplePos="0" relativeHeight="251685888" behindDoc="0" locked="0" layoutInCell="1" allowOverlap="1" wp14:anchorId="2BD29E14" wp14:editId="4C07008A">
-            <wp:simplePos x="0" y="0"/>
-            <wp:positionH relativeFrom="margin">
-              <wp:posOffset>-1827825</wp:posOffset>
-            </wp:positionH>
-            <wp:positionV relativeFrom="paragraph">
-              <wp:posOffset>1532904</wp:posOffset>
-            </wp:positionV>
-            <wp:extent cx="3827145" cy="2083435"/>
-            <wp:effectExtent l="0" t="0" r="1905" b="0"/>
-            <wp:wrapSquare wrapText="bothSides"/>
-            <wp:docPr id="1905806177" name="صورة 13"/>
-            <wp:cNvGraphicFramePr>
-              <a:graphicFrameLocks xmlns:a="http://schemas.openxmlformats.org/drawingml/2006/main" noChangeAspect="1"/>
-            </wp:cNvGraphicFramePr>
-            <a:graphic xmlns:a="http://schemas.openxmlformats.org/drawingml/2006/main">
-              <a:graphicData uri="http://schemas.openxmlformats.org/drawingml/2006/picture">
-                <pic:pic xmlns:pic="http://schemas.openxmlformats.org/drawingml/2006/picture">
-                  <pic:nvPicPr>
-                    <pic:cNvPr id="1905806177" name="صورة 1905806177"/>
-                    <pic:cNvPicPr/>
-                  </pic:nvPicPr>
-                  <pic:blipFill>
-                    <a:blip r:embed="rId19"/>
-                    <a:stretch>
-                      <a:fillRect/>
-                    </a:stretch>
-                  </pic:blipFill>
-                  <pic:spPr>
-                    <a:xfrm>
-                      <a:off x="0" y="0"/>
-                      <a:ext cx="3827145" cy="2083435"/>
-                    </a:xfrm>
-                    <a:prstGeom prst="rect">
-                      <a:avLst/>
-                    </a:prstGeom>
-                  </pic:spPr>
-                </pic:pic>
-              </a:graphicData>
-            </a:graphic>
-            <wp14:sizeRelH relativeFrom="margin">
-              <wp14:pctWidth>0</wp14:pctWidth>
-            </wp14:sizeRelH>
-            <wp14:sizeRelV relativeFrom="margin">
-              <wp14:pctHeight>0</wp14:pctHeight>
-            </wp14:sizeRelV>
-          </wp:anchor>
-        </w:drawing>
-      </w:r>
-    </w:p>
-    <w:p>
-      <w:pPr>
-        <w:pStyle w:val="Heading1"/>
+        <w:t>2.3 Output Results (Screenshots of Table</w:t>
+      </w:r>
+    </w:p>
+    <w:p>
+      <w:pPr>
+        <w:pStyle w:val="1"/>
       </w:pPr>
       <w:r>
         <w:lastRenderedPageBreak/>
@@ -10241,7 +10116,7 @@
     </w:p>
     <w:p>
       <w:pPr>
-        <w:pStyle w:val="ListBullet"/>
+        <w:pStyle w:val="a"/>
         <w:numPr>
           <w:ilvl w:val="0"/>
           <w:numId w:val="0"/>
@@ -10274,7 +10149,7 @@
     </w:p>
     <w:p>
       <w:pPr>
-        <w:pStyle w:val="ListBullet"/>
+        <w:pStyle w:val="a"/>
         <w:rPr>
           <w:rFonts w:ascii="Times New Roman" w:hAnsi="Times New Roman" w:cs="Times New Roman"/>
           <w:color w:val="auto"/>
@@ -10294,7 +10169,7 @@
     </w:p>
     <w:p>
       <w:pPr>
-        <w:pStyle w:val="ListBullet"/>
+        <w:pStyle w:val="a"/>
         <w:rPr>
           <w:rFonts w:ascii="Times New Roman" w:hAnsi="Times New Roman" w:cs="Times New Roman"/>
           <w:color w:val="auto"/>
@@ -10314,7 +10189,7 @@
     </w:p>
     <w:p>
       <w:pPr>
-        <w:pStyle w:val="ListBullet"/>
+        <w:pStyle w:val="a"/>
         <w:rPr>
           <w:rFonts w:ascii="Times New Roman" w:hAnsi="Times New Roman" w:cs="Times New Roman"/>
           <w:color w:val="auto"/>
@@ -10334,7 +10209,7 @@
     </w:p>
     <w:p>
       <w:pPr>
-        <w:pStyle w:val="ListBullet"/>
+        <w:pStyle w:val="a"/>
         <w:rPr>
           <w:rFonts w:ascii="Times New Roman" w:hAnsi="Times New Roman" w:cs="Times New Roman"/>
           <w:color w:val="auto"/>
@@ -10354,7 +10229,7 @@
     </w:p>
     <w:p>
       <w:pPr>
-        <w:pStyle w:val="ListBullet"/>
+        <w:pStyle w:val="a"/>
         <w:rPr>
           <w:rFonts w:ascii="Times New Roman" w:hAnsi="Times New Roman" w:cs="Times New Roman"/>
           <w:color w:val="auto"/>
@@ -10374,7 +10249,7 @@
     </w:p>
     <w:p>
       <w:pPr>
-        <w:pStyle w:val="ListBullet"/>
+        <w:pStyle w:val="a"/>
         <w:rPr>
           <w:rFonts w:ascii="Times New Roman" w:hAnsi="Times New Roman" w:cs="Times New Roman"/>
           <w:color w:val="auto"/>
@@ -10394,7 +10269,7 @@
     </w:p>
     <w:p>
       <w:pPr>
-        <w:pStyle w:val="ListBullet"/>
+        <w:pStyle w:val="a"/>
         <w:rPr>
           <w:rFonts w:ascii="Times New Roman" w:hAnsi="Times New Roman" w:cs="Times New Roman"/>
           <w:color w:val="auto"/>
@@ -10414,7 +10289,7 @@
     </w:p>
     <w:p>
       <w:pPr>
-        <w:pStyle w:val="ListBullet"/>
+        <w:pStyle w:val="a"/>
         <w:numPr>
           <w:ilvl w:val="0"/>
           <w:numId w:val="0"/>
@@ -10431,7 +10306,7 @@
     </w:p>
     <w:p>
       <w:pPr>
-        <w:pStyle w:val="ListBullet"/>
+        <w:pStyle w:val="a"/>
         <w:numPr>
           <w:ilvl w:val="0"/>
           <w:numId w:val="0"/>
@@ -10448,7 +10323,7 @@
     </w:p>
     <w:p>
       <w:pPr>
-        <w:pStyle w:val="ListBullet"/>
+        <w:pStyle w:val="a"/>
         <w:numPr>
           <w:ilvl w:val="0"/>
           <w:numId w:val="0"/>
@@ -10465,7 +10340,7 @@
     </w:p>
     <w:p>
       <w:pPr>
-        <w:pStyle w:val="ListBullet"/>
+        <w:pStyle w:val="a"/>
         <w:numPr>
           <w:ilvl w:val="0"/>
           <w:numId w:val="0"/>
@@ -10482,7 +10357,7 @@
     </w:p>
     <w:p>
       <w:pPr>
-        <w:pStyle w:val="ListBullet"/>
+        <w:pStyle w:val="a"/>
         <w:numPr>
           <w:ilvl w:val="0"/>
           <w:numId w:val="0"/>
@@ -10499,7 +10374,7 @@
     </w:p>
     <w:p>
       <w:pPr>
-        <w:pStyle w:val="ListBullet"/>
+        <w:pStyle w:val="a"/>
         <w:numPr>
           <w:ilvl w:val="0"/>
           <w:numId w:val="0"/>
@@ -10515,7 +10390,7 @@
     </w:p>
     <w:p>
       <w:pPr>
-        <w:pStyle w:val="ListBullet"/>
+        <w:pStyle w:val="a"/>
         <w:numPr>
           <w:ilvl w:val="0"/>
           <w:numId w:val="0"/>
@@ -10531,7 +10406,7 @@
     </w:p>
     <w:p>
       <w:pPr>
-        <w:pStyle w:val="ListBullet"/>
+        <w:pStyle w:val="a"/>
         <w:numPr>
           <w:ilvl w:val="0"/>
           <w:numId w:val="0"/>
@@ -11818,23 +11693,7 @@
           <w:color w:val="00B050"/>
           <w:lang w:eastAsia="en-US"/>
         </w:rPr>
-        <w:t>SELECT</w:t>
-      </w:r>
-      <w:r>
-        <w:rPr>
-          <w:rFonts w:ascii="Helvetica" w:eastAsiaTheme="minorEastAsia" w:hAnsi="Helvetica" w:cs="Times New Roman"/>
-          <w:color w:val="00B050"/>
-          <w:lang w:eastAsia="en-US"/>
-        </w:rPr>
-        <w:t xml:space="preserve"> </w:t>
-      </w:r>
-      <w:r>
-        <w:rPr>
-          <w:rFonts w:ascii="Helvetica" w:eastAsiaTheme="minorEastAsia" w:hAnsi="Helvetica" w:cs="Times New Roman"/>
-          <w:color w:val="00B050"/>
-          <w:lang w:eastAsia="en-US"/>
-        </w:rPr>
-        <w:t xml:space="preserve"> </w:t>
+        <w:t xml:space="preserve">SELECT  </w:t>
       </w:r>
       <w:r>
         <w:rPr>
@@ -12739,7 +12598,7 @@
     </w:p>
     <w:p>
       <w:pPr>
-        <w:pStyle w:val="Heading1"/>
+        <w:pStyle w:val="1"/>
       </w:pPr>
       <w:r>
         <w:lastRenderedPageBreak/>
@@ -12754,7 +12613,7 @@
     </w:p>
     <w:p>
       <w:pPr>
-        <w:pStyle w:val="ListBullet"/>
+        <w:pStyle w:val="a"/>
         <w:numPr>
           <w:ilvl w:val="0"/>
           <w:numId w:val="0"/>
@@ -12796,7 +12655,7 @@
     </w:p>
     <w:p>
       <w:pPr>
-        <w:pStyle w:val="ListBullet"/>
+        <w:pStyle w:val="a"/>
         <w:numPr>
           <w:ilvl w:val="0"/>
           <w:numId w:val="0"/>
@@ -12820,7 +12679,7 @@
     </w:p>
     <w:p>
       <w:pPr>
-        <w:pStyle w:val="ListBullet"/>
+        <w:pStyle w:val="a"/>
         <w:numPr>
           <w:ilvl w:val="0"/>
           <w:numId w:val="0"/>
@@ -12844,7 +12703,7 @@
     </w:p>
     <w:p>
       <w:pPr>
-        <w:pStyle w:val="ListBullet"/>
+        <w:pStyle w:val="a"/>
         <w:numPr>
           <w:ilvl w:val="0"/>
           <w:numId w:val="25"/>
@@ -12867,7 +12726,7 @@
     </w:p>
     <w:p>
       <w:pPr>
-        <w:pStyle w:val="ListBullet"/>
+        <w:pStyle w:val="a"/>
         <w:numPr>
           <w:ilvl w:val="0"/>
           <w:numId w:val="25"/>
@@ -12890,7 +12749,7 @@
     </w:p>
     <w:p>
       <w:pPr>
-        <w:pStyle w:val="ListBullet"/>
+        <w:pStyle w:val="a"/>
         <w:numPr>
           <w:ilvl w:val="0"/>
           <w:numId w:val="25"/>
@@ -12913,7 +12772,7 @@
     </w:p>
     <w:p>
       <w:pPr>
-        <w:pStyle w:val="ListBullet"/>
+        <w:pStyle w:val="a"/>
         <w:numPr>
           <w:ilvl w:val="0"/>
           <w:numId w:val="25"/>
@@ -12936,7 +12795,7 @@
     </w:p>
     <w:p>
       <w:pPr>
-        <w:pStyle w:val="ListBullet"/>
+        <w:pStyle w:val="a"/>
         <w:numPr>
           <w:ilvl w:val="0"/>
           <w:numId w:val="0"/>
@@ -12952,7 +12811,7 @@
     </w:p>
     <w:p>
       <w:pPr>
-        <w:pStyle w:val="Heading1"/>
+        <w:pStyle w:val="1"/>
       </w:pPr>
       <w:r>
         <w:lastRenderedPageBreak/>
@@ -13243,7 +13102,7 @@
       </w:pPr>
     </w:p>
     <w:sectPr>
-      <w:headerReference w:type="default" r:id="rId20"/>
+      <w:headerReference w:type="default" r:id="rId18"/>
       <w:pgSz w:w="12240" w:h="15840" w:code="1"/>
       <w:pgMar w:top="1080" w:right="720" w:bottom="1800" w:left="3096" w:header="1080" w:footer="720" w:gutter="0"/>
       <w:pgNumType w:start="1"/>
@@ -13287,7 +13146,7 @@
 <w:ftr xmlns:wpc="http://schemas.microsoft.com/office/word/2010/wordprocessingCanvas" xmlns:cx="http://schemas.microsoft.com/office/drawing/2014/chartex" xmlns:cx1="http://schemas.microsoft.com/office/drawing/2015/9/8/chartex" xmlns:cx2="http://schemas.microsoft.com/office/drawing/2015/10/21/chartex" xmlns:cx3="http://schemas.microsoft.com/office/drawing/2016/5/9/chartex" xmlns:cx4="http://schemas.microsoft.com/office/drawing/2016/5/10/chartex" xmlns:cx5="http://schemas.microsoft.com/office/drawing/2016/5/11/chartex" xmlns:cx6="http://schemas.microsoft.com/office/drawing/2016/5/12/chartex" xmlns:cx7="http://schemas.microsoft.com/office/drawing/2016/5/13/chartex" xmlns:cx8="http://schemas.microsoft.com/office/drawing/2016/5/14/chartex" xmlns:mc="http://schemas.openxmlformats.org/markup-compatibility/2006" xmlns:aink="http://schemas.microsoft.com/office/drawing/2016/ink" xmlns:am3d="http://schemas.microsoft.com/office/drawing/2017/model3d" xmlns:o="urn:schemas-microsoft-com:office:office" xmlns:oel="http://schemas.microsoft.com/office/2019/extlst" xmlns:r="http://schemas.openxmlformats.org/officeDocument/2006/relationships" xmlns:m="http://schemas.openxmlformats.org/officeDocument/2006/math" xmlns:v="urn:schemas-microsoft-com:vml" xmlns:wp14="http://schemas.microsoft.com/office/word/2010/wordprocessingDrawing" xmlns:wp="http://schemas.openxmlformats.org/drawingml/2006/wordprocessingDrawing" xmlns:w10="urn:schemas-microsoft-com:office:word" xmlns:w="http://schemas.openxmlformats.org/wordprocessingml/2006/main" xmlns:w14="http://schemas.microsoft.com/office/word/2010/wordml" xmlns:w15="http://schemas.microsoft.com/office/word/2012/wordml" xmlns:w16cei="http://schemas.microsoft.com/office/word/2026/wordml/cei" xmlns:w16cex="http://schemas.microsoft.com/office/word/2018/wordml/cex" xmlns:w16cid="http://schemas.microsoft.com/office/word/2016/wordml/cid" xmlns:w16="http://schemas.microsoft.com/office/word/2018/wordml" xmlns:w16du="http://schemas.microsoft.com/office/word/2023/wordml/word16du" xmlns:w16sdtdh="http://schemas.microsoft.com/office/word/2020/wordml/sdtdatahash" xmlns:w16sdtfl="http://schemas.microsoft.com/office/word/2024/wordml/sdtformatlock" xmlns:w16se="http://schemas.microsoft.com/office/word/2015/wordml/symex" xmlns:wpg="http://schemas.microsoft.com/office/word/2010/wordprocessingGroup" xmlns:wpi="http://schemas.microsoft.com/office/word/2010/wordprocessingInk" xmlns:wne="http://schemas.microsoft.com/office/word/2006/wordml" xmlns:wps="http://schemas.microsoft.com/office/word/2010/wordprocessingShape" mc:Ignorable="w14 w15 w16se w16cid w16 w16cex w16sdtdh w16sdtfl w16du wp14">
   <w:p>
     <w:pPr>
-      <w:pStyle w:val="Footer"/>
+      <w:pStyle w:val="a5"/>
     </w:pPr>
     <w:r>
       <w:rPr>
@@ -13390,7 +13249,7 @@
               <v:stroke joinstyle="miter"/>
               <v:path gradientshapeok="t" o:connecttype="rect"/>
             </v:shapetype>
-            <v:shape id="Text Box 9" o:spid="_x0000_s1033" type="#_x0000_t202" alt="Restricted - مقيد " style="position:absolute;left:0;text-align:left;margin-left:0;margin-top:0;width:84.4pt;height:32.1pt;z-index:251663360;visibility:visible;mso-wrap-style:none;mso-wrap-distance-left:0;mso-wrap-distance-top:0;mso-wrap-distance-right:0;mso-wrap-distance-bottom:0;mso-position-horizontal:left;mso-position-horizontal-relative:page;mso-position-vertical:bottom;mso-position-vertical-relative:page;v-text-anchor:bottom" o:gfxdata="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" filled="f" stroked="f">
+            <v:shape id="Text Box 9" o:spid="_x0000_s1033" type="#_x0000_t202" alt="Restricted - مقيد " style="position:absolute;left:0;text-align:left;margin-left:0;margin-top:0;width:84.4pt;height:32.1pt;z-index:251663360;visibility:visible;mso-wrap-style:none;mso-wrap-distance-left:0;mso-wrap-distance-top:0;mso-wrap-distance-right:0;mso-wrap-distance-bottom:0;mso-position-horizontal:left;mso-position-horizontal-relative:page;mso-position-vertical:bottom;mso-position-vertical-relative:page;v-text-anchor:bottom" o:gfxdata="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" filled="f" stroked="f">
               <v:textbox style="mso-fit-shape-to-text:t" inset="20pt,0,0,15pt">
                 <w:txbxContent>
                   <w:p>
@@ -13444,7 +13303,7 @@
 <w:ftr xmlns:wpc="http://schemas.microsoft.com/office/word/2010/wordprocessingCanvas" xmlns:cx="http://schemas.microsoft.com/office/drawing/2014/chartex" xmlns:cx1="http://schemas.microsoft.com/office/drawing/2015/9/8/chartex" xmlns:cx2="http://schemas.microsoft.com/office/drawing/2015/10/21/chartex" xmlns:cx3="http://schemas.microsoft.com/office/drawing/2016/5/9/chartex" xmlns:cx4="http://schemas.microsoft.com/office/drawing/2016/5/10/chartex" xmlns:cx5="http://schemas.microsoft.com/office/drawing/2016/5/11/chartex" xmlns:cx6="http://schemas.microsoft.com/office/drawing/2016/5/12/chartex" xmlns:cx7="http://schemas.microsoft.com/office/drawing/2016/5/13/chartex" xmlns:cx8="http://schemas.microsoft.com/office/drawing/2016/5/14/chartex" xmlns:mc="http://schemas.openxmlformats.org/markup-compatibility/2006" xmlns:aink="http://schemas.microsoft.com/office/drawing/2016/ink" xmlns:am3d="http://schemas.microsoft.com/office/drawing/2017/model3d" xmlns:o="urn:schemas-microsoft-com:office:office" xmlns:oel="http://schemas.microsoft.com/office/2019/extlst" xmlns:r="http://schemas.openxmlformats.org/officeDocument/2006/relationships" xmlns:m="http://schemas.openxmlformats.org/officeDocument/2006/math" xmlns:v="urn:schemas-microsoft-com:vml" xmlns:wp14="http://schemas.microsoft.com/office/word/2010/wordprocessingDrawing" xmlns:wp="http://schemas.openxmlformats.org/drawingml/2006/wordprocessingDrawing" xmlns:w10="urn:schemas-microsoft-com:office:word" xmlns:w="http://schemas.openxmlformats.org/wordprocessingml/2006/main" xmlns:w14="http://schemas.microsoft.com/office/word/2010/wordml" xmlns:w15="http://schemas.microsoft.com/office/word/2012/wordml" xmlns:w16cei="http://schemas.microsoft.com/office/word/2026/wordml/cei" xmlns:w16cex="http://schemas.microsoft.com/office/word/2018/wordml/cex" xmlns:w16cid="http://schemas.microsoft.com/office/word/2016/wordml/cid" xmlns:w16="http://schemas.microsoft.com/office/word/2018/wordml" xmlns:w16du="http://schemas.microsoft.com/office/word/2023/wordml/word16du" xmlns:w16sdtdh="http://schemas.microsoft.com/office/word/2020/wordml/sdtdatahash" xmlns:w16sdtfl="http://schemas.microsoft.com/office/word/2024/wordml/sdtformatlock" xmlns:w16se="http://schemas.microsoft.com/office/word/2015/wordml/symex" xmlns:wpg="http://schemas.microsoft.com/office/word/2010/wordprocessingGroup" xmlns:wpi="http://schemas.microsoft.com/office/word/2010/wordprocessingInk" xmlns:wne="http://schemas.microsoft.com/office/word/2006/wordml" xmlns:wps="http://schemas.microsoft.com/office/word/2010/wordprocessingShape" mc:Ignorable="w14 w15 w16se w16cid w16 w16cex w16sdtdh w16sdtfl w16du wp14">
   <w:p>
     <w:pPr>
-      <w:pStyle w:val="Footer"/>
+      <w:pStyle w:val="a5"/>
     </w:pPr>
     <w:r>
       <w:rPr>
@@ -13547,7 +13406,7 @@
               <v:stroke joinstyle="miter"/>
               <v:path gradientshapeok="t" o:connecttype="rect"/>
             </v:shapetype>
-            <v:shape id="Text Box 10" o:spid="_x0000_s1034" type="#_x0000_t202" alt="Restricted - مقيد " style="position:absolute;left:0;text-align:left;margin-left:0;margin-top:0;width:84.4pt;height:32.1pt;z-index:251664384;visibility:visible;mso-wrap-style:none;mso-wrap-distance-left:0;mso-wrap-distance-top:0;mso-wrap-distance-right:0;mso-wrap-distance-bottom:0;mso-position-horizontal:left;mso-position-horizontal-relative:page;mso-position-vertical:bottom;mso-position-vertical-relative:page;v-text-anchor:bottom" o:gfxdata="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" filled="f" stroked="f">
+            <v:shape id="Text Box 10" o:spid="_x0000_s1034" type="#_x0000_t202" alt="Restricted - مقيد " style="position:absolute;left:0;text-align:left;margin-left:0;margin-top:0;width:84.4pt;height:32.1pt;z-index:251664384;visibility:visible;mso-wrap-style:none;mso-wrap-distance-left:0;mso-wrap-distance-top:0;mso-wrap-distance-right:0;mso-wrap-distance-bottom:0;mso-position-horizontal:left;mso-position-horizontal-relative:page;mso-position-vertical:bottom;mso-position-vertical-relative:page;v-text-anchor:bottom" o:gfxdata="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" filled="f" stroked="f">
               <v:textbox style="mso-fit-shape-to-text:t" inset="20pt,0,0,15pt">
                 <w:txbxContent>
                   <w:p>
@@ -13601,7 +13460,7 @@
 <w:ftr xmlns:wpc="http://schemas.microsoft.com/office/word/2010/wordprocessingCanvas" xmlns:cx="http://schemas.microsoft.com/office/drawing/2014/chartex" xmlns:cx1="http://schemas.microsoft.com/office/drawing/2015/9/8/chartex" xmlns:cx2="http://schemas.microsoft.com/office/drawing/2015/10/21/chartex" xmlns:cx3="http://schemas.microsoft.com/office/drawing/2016/5/9/chartex" xmlns:cx4="http://schemas.microsoft.com/office/drawing/2016/5/10/chartex" xmlns:cx5="http://schemas.microsoft.com/office/drawing/2016/5/11/chartex" xmlns:cx6="http://schemas.microsoft.com/office/drawing/2016/5/12/chartex" xmlns:cx7="http://schemas.microsoft.com/office/drawing/2016/5/13/chartex" xmlns:cx8="http://schemas.microsoft.com/office/drawing/2016/5/14/chartex" xmlns:mc="http://schemas.openxmlformats.org/markup-compatibility/2006" xmlns:aink="http://schemas.microsoft.com/office/drawing/2016/ink" xmlns:am3d="http://schemas.microsoft.com/office/drawing/2017/model3d" xmlns:o="urn:schemas-microsoft-com:office:office" xmlns:oel="http://schemas.microsoft.com/office/2019/extlst" xmlns:r="http://schemas.openxmlformats.org/officeDocument/2006/relationships" xmlns:m="http://schemas.openxmlformats.org/officeDocument/2006/math" xmlns:v="urn:schemas-microsoft-com:vml" xmlns:wp14="http://schemas.microsoft.com/office/word/2010/wordprocessingDrawing" xmlns:wp="http://schemas.openxmlformats.org/drawingml/2006/wordprocessingDrawing" xmlns:w10="urn:schemas-microsoft-com:office:word" xmlns:w="http://schemas.openxmlformats.org/wordprocessingml/2006/main" xmlns:w14="http://schemas.microsoft.com/office/word/2010/wordml" xmlns:w15="http://schemas.microsoft.com/office/word/2012/wordml" xmlns:w16cei="http://schemas.microsoft.com/office/word/2026/wordml/cei" xmlns:w16cex="http://schemas.microsoft.com/office/word/2018/wordml/cex" xmlns:w16cid="http://schemas.microsoft.com/office/word/2016/wordml/cid" xmlns:w16="http://schemas.microsoft.com/office/word/2018/wordml" xmlns:w16du="http://schemas.microsoft.com/office/word/2023/wordml/word16du" xmlns:w16sdtdh="http://schemas.microsoft.com/office/word/2020/wordml/sdtdatahash" xmlns:w16sdtfl="http://schemas.microsoft.com/office/word/2024/wordml/sdtformatlock" xmlns:w16se="http://schemas.microsoft.com/office/word/2015/wordml/symex" xmlns:wpg="http://schemas.microsoft.com/office/word/2010/wordprocessingGroup" xmlns:wpi="http://schemas.microsoft.com/office/word/2010/wordprocessingInk" xmlns:wne="http://schemas.microsoft.com/office/word/2006/wordml" xmlns:wps="http://schemas.microsoft.com/office/word/2010/wordprocessingShape" mc:Ignorable="w14 w15 w16se w16cid w16 w16cex w16sdtdh w16sdtfl w16du wp14">
   <w:p>
     <w:pPr>
-      <w:pStyle w:val="Footer"/>
+      <w:pStyle w:val="a5"/>
     </w:pPr>
     <w:r>
       <w:rPr>
@@ -13704,7 +13563,7 @@
               <v:stroke joinstyle="miter"/>
               <v:path gradientshapeok="t" o:connecttype="rect"/>
             </v:shapetype>
-            <v:shape id="Text Box 8" o:spid="_x0000_s1035" type="#_x0000_t202" alt="Restricted - مقيد " style="position:absolute;left:0;text-align:left;margin-left:0;margin-top:0;width:84.4pt;height:32.1pt;z-index:251662336;visibility:visible;mso-wrap-style:none;mso-wrap-distance-left:0;mso-wrap-distance-top:0;mso-wrap-distance-right:0;mso-wrap-distance-bottom:0;mso-position-horizontal:left;mso-position-horizontal-relative:page;mso-position-vertical:bottom;mso-position-vertical-relative:page;v-text-anchor:bottom" o:gfxdata="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" filled="f" stroked="f">
+            <v:shape id="Text Box 8" o:spid="_x0000_s1035" type="#_x0000_t202" alt="Restricted - مقيد " style="position:absolute;left:0;text-align:left;margin-left:0;margin-top:0;width:84.4pt;height:32.1pt;z-index:251662336;visibility:visible;mso-wrap-style:none;mso-wrap-distance-left:0;mso-wrap-distance-top:0;mso-wrap-distance-right:0;mso-wrap-distance-bottom:0;mso-position-horizontal:left;mso-position-horizontal-relative:page;mso-position-vertical:bottom;mso-position-vertical-relative:page;v-text-anchor:bottom" o:gfxdata="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" filled="f" stroked="f">
               <v:textbox style="mso-fit-shape-to-text:t" inset="20pt,0,0,15pt">
                 <w:txbxContent>
                   <w:p>
@@ -13848,7 +13707,7 @@
         </w:tcPr>
         <w:p>
           <w:pPr>
-            <w:pStyle w:val="Header"/>
+            <w:pStyle w:val="a7"/>
           </w:pPr>
         </w:p>
       </w:tc>
@@ -13858,7 +13717,7 @@
         </w:tcPr>
         <w:p>
           <w:pPr>
-            <w:pStyle w:val="Header"/>
+            <w:pStyle w:val="a7"/>
           </w:pPr>
         </w:p>
       </w:tc>
@@ -13869,7 +13728,7 @@
         </w:tcPr>
         <w:p>
           <w:pPr>
-            <w:pStyle w:val="Header"/>
+            <w:pStyle w:val="a7"/>
           </w:pPr>
         </w:p>
       </w:tc>
@@ -13877,7 +13736,7 @@
   </w:tbl>
   <w:p>
     <w:pPr>
-      <w:pStyle w:val="Header"/>
+      <w:pStyle w:val="a7"/>
     </w:pPr>
   </w:p>
 </w:hdr>
@@ -14163,9 +14022,32 @@
           </w:r>
           <w:r>
             <w:rPr>
+              <w:rFonts w:hint="cs"/>
+              <w:b w:val="0"/>
+              <w:bCs w:val="0"/>
+              <w:noProof/>
+              <w:rtl/>
+            </w:rPr>
+            <w:instrText xml:space="preserve">خطأ! استخدم علامة التبويب "الصفحة الرئيسية" لتطبيق </w:instrText>
+          </w:r>
+          <w:r>
+            <w:rPr>
+              <w:rFonts w:hint="cs"/>
+              <w:b w:val="0"/>
+              <w:bCs w:val="0"/>
               <w:noProof/>
             </w:rPr>
-            <w:instrText>Task 4 – Reflection (2 Marks)</w:instrText>
+            <w:instrText>Heading 1</w:instrText>
+          </w:r>
+          <w:r>
+            <w:rPr>
+              <w:rFonts w:hint="cs"/>
+              <w:b w:val="0"/>
+              <w:bCs w:val="0"/>
+              <w:noProof/>
+              <w:rtl/>
+            </w:rPr>
+            <w:instrText xml:space="preserve"> على النص الذي ترغب في أن يظهر هنا.</w:instrText>
           </w:r>
           <w:r>
             <w:rPr>
@@ -14196,9 +14078,32 @@
           </w:r>
           <w:r>
             <w:rPr>
+              <w:rFonts w:hint="cs"/>
+              <w:b w:val="0"/>
+              <w:bCs w:val="0"/>
+              <w:noProof/>
+              <w:rtl/>
+            </w:rPr>
+            <w:instrText xml:space="preserve">خطأ! استخدم علامة التبويب "الصفحة الرئيسية" لتطبيق </w:instrText>
+          </w:r>
+          <w:r>
+            <w:rPr>
+              <w:rFonts w:hint="cs"/>
+              <w:b w:val="0"/>
+              <w:bCs w:val="0"/>
               <w:noProof/>
             </w:rPr>
-            <w:instrText>Task 4 – Reflection (2 Marks)</w:instrText>
+            <w:instrText>Heading 1</w:instrText>
+          </w:r>
+          <w:r>
+            <w:rPr>
+              <w:rFonts w:hint="cs"/>
+              <w:b w:val="0"/>
+              <w:bCs w:val="0"/>
+              <w:noProof/>
+              <w:rtl/>
+            </w:rPr>
+            <w:instrText xml:space="preserve"> على النص الذي ترغب في أن يظهر هنا.</w:instrText>
           </w:r>
           <w:r>
             <w:rPr>
@@ -14214,9 +14119,38 @@
           </w:r>
           <w:r>
             <w:rPr>
+              <w:rFonts w:hint="cs"/>
+              <w:b w:val="0"/>
+              <w:bCs w:val="0"/>
+              <w:noProof/>
+              <w:rtl/>
+            </w:rPr>
+            <w:t xml:space="preserve">خطأ! استخدم علامة التبويب "الصفحة الرئيسية" لتطبيق </w:t>
+          </w:r>
+          <w:r>
+            <w:rPr>
+              <w:rFonts w:hint="cs"/>
+              <w:b w:val="0"/>
+              <w:bCs w:val="0"/>
               <w:noProof/>
             </w:rPr>
-            <w:t xml:space="preserve">Task 4 – Reflection (2 Marks) </w:t>
+            <w:t>Heading 1</w:t>
+          </w:r>
+          <w:r>
+            <w:rPr>
+              <w:rFonts w:hint="cs"/>
+              <w:b w:val="0"/>
+              <w:bCs w:val="0"/>
+              <w:noProof/>
+              <w:rtl/>
+            </w:rPr>
+            <w:t xml:space="preserve"> على النص الذي ترغب في أن يظهر هنا.</w:t>
+          </w:r>
+          <w:r>
+            <w:rPr>
+              <w:noProof/>
+            </w:rPr>
+            <w:t xml:space="preserve"> </w:t>
           </w:r>
           <w:r>
             <w:fldChar w:fldCharType="end"/>
@@ -14282,7 +14216,7 @@
     <w:lvl w:ilvl="0">
       <w:start w:val="1"/>
       <w:numFmt w:val="bullet"/>
-      <w:pStyle w:val="ListBullet"/>
+      <w:pStyle w:val="a"/>
       <w:lvlText w:val="•"/>
       <w:lvlJc w:val="left"/>
       <w:pPr>
@@ -15234,7 +15168,7 @@
     <w:lvl w:ilvl="0">
       <w:start w:val="1"/>
       <w:numFmt w:val="decimal"/>
-      <w:pStyle w:val="ListNumber"/>
+      <w:pStyle w:val="a0"/>
       <w:lvlText w:val="%1."/>
       <w:lvlJc w:val="left"/>
       <w:pPr>
@@ -15248,7 +15182,7 @@
     <w:lvl w:ilvl="1">
       <w:start w:val="1"/>
       <w:numFmt w:val="decimal"/>
-      <w:pStyle w:val="ListNumber2"/>
+      <w:pStyle w:val="2"/>
       <w:suff w:val="space"/>
       <w:lvlText w:val="%1.%2"/>
       <w:lvlJc w:val="left"/>
@@ -15263,7 +15197,7 @@
     <w:lvl w:ilvl="2">
       <w:start w:val="1"/>
       <w:numFmt w:val="lowerLetter"/>
-      <w:pStyle w:val="ListNumber3"/>
+      <w:pStyle w:val="3"/>
       <w:lvlText w:val="%3."/>
       <w:lvlJc w:val="left"/>
       <w:pPr>
@@ -15277,7 +15211,7 @@
     <w:lvl w:ilvl="3">
       <w:start w:val="1"/>
       <w:numFmt w:val="lowerRoman"/>
-      <w:pStyle w:val="ListNumber4"/>
+      <w:pStyle w:val="4"/>
       <w:lvlText w:val="%4."/>
       <w:lvlJc w:val="left"/>
       <w:pPr>
@@ -15291,7 +15225,7 @@
     <w:lvl w:ilvl="4">
       <w:start w:val="1"/>
       <w:numFmt w:val="lowerLetter"/>
-      <w:pStyle w:val="ListNumber5"/>
+      <w:pStyle w:val="5"/>
       <w:lvlText w:val="(%5)"/>
       <w:lvlJc w:val="left"/>
       <w:pPr>
@@ -17021,16 +16955,16 @@
     <w:lsdException w:name="Unresolved Mention" w:semiHidden="1" w:unhideWhenUsed="1"/>
     <w:lsdException w:name="Smart Link" w:semiHidden="1" w:unhideWhenUsed="1"/>
   </w:latentStyles>
-  <w:style w:type="paragraph" w:default="1" w:styleId="Normal">
+  <w:style w:type="paragraph" w:default="1" w:styleId="a1">
     <w:name w:val="Normal"/>
     <w:qFormat/>
     <w:rsid w:val="00407799"/>
   </w:style>
-  <w:style w:type="paragraph" w:styleId="Heading1">
+  <w:style w:type="paragraph" w:styleId="1">
     <w:name w:val="heading 1"/>
-    <w:basedOn w:val="Normal"/>
-    <w:next w:val="Normal"/>
-    <w:link w:val="Heading1Char"/>
+    <w:basedOn w:val="a1"/>
+    <w:next w:val="a1"/>
+    <w:link w:val="1Char"/>
     <w:uiPriority w:val="1"/>
     <w:qFormat/>
     <w:pPr>
@@ -17049,11 +16983,11 @@
       <w:sz w:val="40"/>
     </w:rPr>
   </w:style>
-  <w:style w:type="paragraph" w:styleId="Heading2">
+  <w:style w:type="paragraph" w:styleId="20">
     <w:name w:val="heading 2"/>
-    <w:basedOn w:val="Normal"/>
-    <w:next w:val="Normal"/>
-    <w:link w:val="Heading2Char"/>
+    <w:basedOn w:val="a1"/>
+    <w:next w:val="a1"/>
+    <w:link w:val="2Char"/>
     <w:uiPriority w:val="1"/>
     <w:unhideWhenUsed/>
     <w:qFormat/>
@@ -17071,13 +17005,13 @@
       <w:sz w:val="28"/>
     </w:rPr>
   </w:style>
-  <w:style w:type="character" w:default="1" w:styleId="DefaultParagraphFont">
+  <w:style w:type="character" w:default="1" w:styleId="a2">
     <w:name w:val="Default Paragraph Font"/>
     <w:uiPriority w:val="1"/>
     <w:semiHidden/>
     <w:unhideWhenUsed/>
   </w:style>
-  <w:style w:type="table" w:default="1" w:styleId="TableNormal">
+  <w:style w:type="table" w:default="1" w:styleId="a3">
     <w:name w:val="Normal Table"/>
     <w:uiPriority w:val="99"/>
     <w:semiHidden/>
@@ -17092,16 +17026,16 @@
       </w:tblCellMar>
     </w:tblPr>
   </w:style>
-  <w:style w:type="numbering" w:default="1" w:styleId="NoList">
+  <w:style w:type="numbering" w:default="1" w:styleId="a4">
     <w:name w:val="No List"/>
     <w:uiPriority w:val="99"/>
     <w:semiHidden/>
     <w:unhideWhenUsed/>
   </w:style>
-  <w:style w:type="paragraph" w:styleId="Footer">
+  <w:style w:type="paragraph" w:styleId="a5">
     <w:name w:val="footer"/>
-    <w:basedOn w:val="Normal"/>
-    <w:link w:val="FooterChar"/>
+    <w:basedOn w:val="a1"/>
+    <w:link w:val="Char"/>
     <w:uiPriority w:val="99"/>
     <w:unhideWhenUsed/>
     <w:qFormat/>
@@ -17113,20 +17047,20 @@
       <w:color w:val="EF4623" w:themeColor="accent1"/>
     </w:rPr>
   </w:style>
-  <w:style w:type="character" w:customStyle="1" w:styleId="FooterChar">
-    <w:name w:val="Footer Char"/>
-    <w:basedOn w:val="DefaultParagraphFont"/>
-    <w:link w:val="Footer"/>
+  <w:style w:type="character" w:customStyle="1" w:styleId="Char">
+    <w:name w:val="تذييل الصفحة Char"/>
+    <w:basedOn w:val="a2"/>
+    <w:link w:val="a5"/>
     <w:uiPriority w:val="99"/>
     <w:rPr>
       <w:color w:val="EF4623" w:themeColor="accent1"/>
     </w:rPr>
   </w:style>
-  <w:style w:type="paragraph" w:styleId="Subtitle">
+  <w:style w:type="paragraph" w:styleId="a6">
     <w:name w:val="Subtitle"/>
-    <w:basedOn w:val="Normal"/>
-    <w:next w:val="Normal"/>
-    <w:link w:val="SubtitleChar"/>
+    <w:basedOn w:val="a1"/>
+    <w:next w:val="a1"/>
+    <w:link w:val="Char0"/>
     <w:uiPriority w:val="3"/>
     <w:unhideWhenUsed/>
     <w:qFormat/>
@@ -17149,36 +17083,36 @@
   </w:style>
   <w:style w:type="paragraph" w:customStyle="1" w:styleId="Graphic">
     <w:name w:val="Graphic"/>
-    <w:basedOn w:val="Normal"/>
+    <w:basedOn w:val="a1"/>
     <w:uiPriority w:val="99"/>
     <w:pPr>
       <w:spacing w:after="80" w:line="240" w:lineRule="auto"/>
       <w:jc w:val="center"/>
     </w:pPr>
   </w:style>
-  <w:style w:type="paragraph" w:styleId="Header">
+  <w:style w:type="paragraph" w:styleId="a7">
     <w:name w:val="header"/>
-    <w:basedOn w:val="Normal"/>
-    <w:link w:val="HeaderChar"/>
+    <w:basedOn w:val="a1"/>
+    <w:link w:val="Char1"/>
     <w:uiPriority w:val="99"/>
     <w:qFormat/>
     <w:pPr>
       <w:spacing w:after="380" w:line="240" w:lineRule="auto"/>
     </w:pPr>
   </w:style>
-  <w:style w:type="character" w:customStyle="1" w:styleId="HeaderChar">
-    <w:name w:val="Header Char"/>
-    <w:basedOn w:val="DefaultParagraphFont"/>
-    <w:link w:val="Header"/>
+  <w:style w:type="character" w:customStyle="1" w:styleId="Char1">
+    <w:name w:val="رأس الصفحة Char"/>
+    <w:basedOn w:val="a2"/>
+    <w:link w:val="a7"/>
     <w:uiPriority w:val="99"/>
     <w:rPr>
       <w:color w:val="404040" w:themeColor="text1" w:themeTint="BF"/>
       <w:sz w:val="20"/>
     </w:rPr>
   </w:style>
-  <w:style w:type="table" w:styleId="TableGrid">
+  <w:style w:type="table" w:styleId="a8">
     <w:name w:val="Table Grid"/>
-    <w:basedOn w:val="TableNormal"/>
+    <w:basedOn w:val="a3"/>
     <w:uiPriority w:val="39"/>
     <w:pPr>
       <w:spacing w:before="120" w:after="120" w:line="240" w:lineRule="auto"/>
@@ -17235,7 +17169,7 @@
   </w:style>
   <w:style w:type="paragraph" w:customStyle="1" w:styleId="InfoHeading">
     <w:name w:val="Info Heading"/>
-    <w:basedOn w:val="Normal"/>
+    <w:basedOn w:val="a1"/>
     <w:uiPriority w:val="2"/>
     <w:qFormat/>
     <w:pPr>
@@ -17252,8 +17186,8 @@
   </w:style>
   <w:style w:type="paragraph" w:customStyle="1" w:styleId="Page">
     <w:name w:val="Page"/>
-    <w:basedOn w:val="Normal"/>
-    <w:next w:val="Normal"/>
+    <w:basedOn w:val="a1"/>
+    <w:next w:val="a1"/>
     <w:uiPriority w:val="99"/>
     <w:unhideWhenUsed/>
     <w:qFormat/>
@@ -17266,11 +17200,11 @@
       <w:sz w:val="36"/>
     </w:rPr>
   </w:style>
-  <w:style w:type="paragraph" w:styleId="Title">
+  <w:style w:type="paragraph" w:styleId="a9">
     <w:name w:val="Title"/>
-    <w:basedOn w:val="Normal"/>
-    <w:next w:val="Normal"/>
-    <w:link w:val="TitleChar"/>
+    <w:basedOn w:val="a1"/>
+    <w:next w:val="a1"/>
+    <w:link w:val="Char2"/>
     <w:uiPriority w:val="2"/>
     <w:qFormat/>
     <w:pPr>
@@ -17284,10 +17218,10 @@
       <w:sz w:val="200"/>
     </w:rPr>
   </w:style>
-  <w:style w:type="character" w:customStyle="1" w:styleId="TitleChar">
-    <w:name w:val="Title Char"/>
-    <w:basedOn w:val="DefaultParagraphFont"/>
-    <w:link w:val="Title"/>
+  <w:style w:type="character" w:customStyle="1" w:styleId="Char2">
+    <w:name w:val="العنوان Char"/>
+    <w:basedOn w:val="a2"/>
+    <w:link w:val="a9"/>
     <w:uiPriority w:val="2"/>
     <w:rPr>
       <w:rFonts w:asciiTheme="majorHAnsi" w:eastAsiaTheme="majorEastAsia" w:hAnsiTheme="majorHAnsi" w:cstheme="majorBidi"/>
@@ -17297,19 +17231,19 @@
       <w:sz w:val="200"/>
     </w:rPr>
   </w:style>
-  <w:style w:type="character" w:styleId="PlaceholderText">
+  <w:style w:type="character" w:styleId="aa">
     <w:name w:val="Placeholder Text"/>
-    <w:basedOn w:val="DefaultParagraphFont"/>
+    <w:basedOn w:val="a2"/>
     <w:uiPriority w:val="99"/>
     <w:semiHidden/>
     <w:rPr>
       <w:color w:val="808080"/>
     </w:rPr>
   </w:style>
-  <w:style w:type="paragraph" w:styleId="BalloonText">
+  <w:style w:type="paragraph" w:styleId="ab">
     <w:name w:val="Balloon Text"/>
-    <w:basedOn w:val="Normal"/>
-    <w:link w:val="BalloonTextChar"/>
+    <w:basedOn w:val="a1"/>
+    <w:link w:val="Char3"/>
     <w:uiPriority w:val="99"/>
     <w:semiHidden/>
     <w:unhideWhenUsed/>
@@ -17321,10 +17255,10 @@
       <w:sz w:val="16"/>
     </w:rPr>
   </w:style>
-  <w:style w:type="character" w:customStyle="1" w:styleId="BalloonTextChar">
-    <w:name w:val="Balloon Text Char"/>
-    <w:basedOn w:val="DefaultParagraphFont"/>
-    <w:link w:val="BalloonText"/>
+  <w:style w:type="character" w:customStyle="1" w:styleId="Char3">
+    <w:name w:val="نص في بالون Char"/>
+    <w:basedOn w:val="a2"/>
+    <w:link w:val="ab"/>
     <w:uiPriority w:val="99"/>
     <w:semiHidden/>
     <w:rPr>
@@ -17332,9 +17266,9 @@
       <w:sz w:val="16"/>
     </w:rPr>
   </w:style>
-  <w:style w:type="character" w:styleId="Strong">
+  <w:style w:type="character" w:styleId="ac">
     <w:name w:val="Strong"/>
-    <w:basedOn w:val="DefaultParagraphFont"/>
+    <w:basedOn w:val="a2"/>
     <w:uiPriority w:val="10"/>
     <w:qFormat/>
     <w:rPr>
@@ -17342,10 +17276,10 @@
       <w:bCs/>
     </w:rPr>
   </w:style>
-  <w:style w:type="character" w:customStyle="1" w:styleId="SubtitleChar">
-    <w:name w:val="Subtitle Char"/>
-    <w:basedOn w:val="DefaultParagraphFont"/>
-    <w:link w:val="Subtitle"/>
+  <w:style w:type="character" w:customStyle="1" w:styleId="Char0">
+    <w:name w:val="عنوان فرعي Char"/>
+    <w:basedOn w:val="a2"/>
+    <w:link w:val="a6"/>
     <w:uiPriority w:val="3"/>
     <w:rPr>
       <w:rFonts w:asciiTheme="majorHAnsi" w:eastAsiaTheme="majorEastAsia" w:hAnsiTheme="majorHAnsi" w:cstheme="majorBidi"/>
@@ -17359,7 +17293,7 @@
   </w:style>
   <w:style w:type="paragraph" w:customStyle="1" w:styleId="Abstract">
     <w:name w:val="Abstract"/>
-    <w:basedOn w:val="Normal"/>
+    <w:basedOn w:val="a1"/>
     <w:uiPriority w:val="3"/>
     <w:qFormat/>
     <w:pPr>
@@ -17373,9 +17307,9 @@
       <w:sz w:val="28"/>
     </w:rPr>
   </w:style>
-  <w:style w:type="paragraph" w:styleId="NoSpacing">
+  <w:style w:type="paragraph" w:styleId="ad">
     <w:name w:val="No Spacing"/>
-    <w:link w:val="NoSpacingChar"/>
+    <w:link w:val="Char4"/>
     <w:uiPriority w:val="1"/>
     <w:unhideWhenUsed/>
     <w:qFormat/>
@@ -17385,7 +17319,7 @@
   </w:style>
   <w:style w:type="character" w:styleId="Hyperlink">
     <w:name w:val="Hyperlink"/>
-    <w:basedOn w:val="DefaultParagraphFont"/>
+    <w:basedOn w:val="a2"/>
     <w:uiPriority w:val="99"/>
     <w:unhideWhenUsed/>
     <w:rPr>
@@ -17393,10 +17327,10 @@
       <w:u w:val="single"/>
     </w:rPr>
   </w:style>
-  <w:style w:type="paragraph" w:styleId="TOC1">
+  <w:style w:type="paragraph" w:styleId="10">
     <w:name w:val="toc 1"/>
-    <w:basedOn w:val="Normal"/>
-    <w:next w:val="Normal"/>
+    <w:basedOn w:val="a1"/>
+    <w:next w:val="a1"/>
     <w:autoRedefine/>
     <w:uiPriority w:val="39"/>
     <w:unhideWhenUsed/>
@@ -17411,10 +17345,10 @@
       <w:kern w:val="20"/>
     </w:rPr>
   </w:style>
-  <w:style w:type="character" w:customStyle="1" w:styleId="Heading1Char">
-    <w:name w:val="Heading 1 Char"/>
-    <w:basedOn w:val="DefaultParagraphFont"/>
-    <w:link w:val="Heading1"/>
+  <w:style w:type="character" w:customStyle="1" w:styleId="1Char">
+    <w:name w:val="العنوان 1 Char"/>
+    <w:basedOn w:val="a2"/>
+    <w:link w:val="1"/>
     <w:uiPriority w:val="1"/>
     <w:rPr>
       <w:rFonts w:asciiTheme="majorHAnsi" w:eastAsiaTheme="majorEastAsia" w:hAnsiTheme="majorHAnsi" w:cstheme="majorBidi"/>
@@ -17424,10 +17358,10 @@
       <w:sz w:val="40"/>
     </w:rPr>
   </w:style>
-  <w:style w:type="paragraph" w:styleId="TOCHeading">
+  <w:style w:type="paragraph" w:styleId="ae">
     <w:name w:val="TOC Heading"/>
-    <w:basedOn w:val="Heading1"/>
-    <w:next w:val="Normal"/>
+    <w:basedOn w:val="1"/>
+    <w:next w:val="a1"/>
     <w:uiPriority w:val="39"/>
     <w:unhideWhenUsed/>
     <w:qFormat/>
@@ -17444,10 +17378,10 @@
       <w:sz w:val="44"/>
     </w:rPr>
   </w:style>
-  <w:style w:type="character" w:customStyle="1" w:styleId="Heading2Char">
-    <w:name w:val="Heading 2 Char"/>
-    <w:basedOn w:val="DefaultParagraphFont"/>
-    <w:link w:val="Heading2"/>
+  <w:style w:type="character" w:customStyle="1" w:styleId="2Char">
+    <w:name w:val="عنوان 2 Char"/>
+    <w:basedOn w:val="a2"/>
+    <w:link w:val="20"/>
     <w:uiPriority w:val="1"/>
     <w:rPr>
       <w:rFonts w:asciiTheme="majorHAnsi" w:eastAsiaTheme="majorEastAsia" w:hAnsiTheme="majorHAnsi" w:cstheme="majorBidi"/>
@@ -17457,11 +17391,11 @@
       <w:sz w:val="28"/>
     </w:rPr>
   </w:style>
-  <w:style w:type="paragraph" w:styleId="Quote">
+  <w:style w:type="paragraph" w:styleId="af">
     <w:name w:val="Quote"/>
-    <w:basedOn w:val="Normal"/>
-    <w:next w:val="Normal"/>
-    <w:link w:val="QuoteChar"/>
+    <w:basedOn w:val="a1"/>
+    <w:next w:val="a1"/>
+    <w:link w:val="Char5"/>
     <w:uiPriority w:val="1"/>
     <w:unhideWhenUsed/>
     <w:qFormat/>
@@ -17476,10 +17410,10 @@
       <w:sz w:val="24"/>
     </w:rPr>
   </w:style>
-  <w:style w:type="character" w:customStyle="1" w:styleId="QuoteChar">
-    <w:name w:val="Quote Char"/>
-    <w:basedOn w:val="DefaultParagraphFont"/>
-    <w:link w:val="Quote"/>
+  <w:style w:type="character" w:customStyle="1" w:styleId="Char5">
+    <w:name w:val="اقتباس Char"/>
+    <w:basedOn w:val="a2"/>
+    <w:link w:val="af"/>
     <w:uiPriority w:val="1"/>
     <w:rPr>
       <w:i/>
@@ -17489,10 +17423,10 @@
       <w:sz w:val="24"/>
     </w:rPr>
   </w:style>
-  <w:style w:type="paragraph" w:styleId="Signature">
+  <w:style w:type="paragraph" w:styleId="af0">
     <w:name w:val="Signature"/>
-    <w:basedOn w:val="Normal"/>
-    <w:link w:val="SignatureChar"/>
+    <w:basedOn w:val="a1"/>
+    <w:link w:val="Char6"/>
     <w:uiPriority w:val="9"/>
     <w:unhideWhenUsed/>
     <w:qFormat/>
@@ -17505,25 +17439,25 @@
       <w:kern w:val="20"/>
     </w:rPr>
   </w:style>
-  <w:style w:type="character" w:customStyle="1" w:styleId="SignatureChar">
-    <w:name w:val="Signature Char"/>
-    <w:basedOn w:val="DefaultParagraphFont"/>
-    <w:link w:val="Signature"/>
+  <w:style w:type="character" w:customStyle="1" w:styleId="Char6">
+    <w:name w:val="توقيع Char"/>
+    <w:basedOn w:val="a2"/>
+    <w:link w:val="af0"/>
     <w:uiPriority w:val="9"/>
     <w:rPr>
       <w:color w:val="595959" w:themeColor="text1" w:themeTint="A6"/>
       <w:kern w:val="20"/>
     </w:rPr>
   </w:style>
-  <w:style w:type="character" w:customStyle="1" w:styleId="NoSpacingChar">
-    <w:name w:val="No Spacing Char"/>
-    <w:basedOn w:val="DefaultParagraphFont"/>
-    <w:link w:val="NoSpacing"/>
+  <w:style w:type="character" w:customStyle="1" w:styleId="Char4">
+    <w:name w:val="بلا تباعد Char"/>
+    <w:basedOn w:val="a2"/>
+    <w:link w:val="ad"/>
     <w:uiPriority w:val="1"/>
   </w:style>
-  <w:style w:type="paragraph" w:styleId="ListBullet">
+  <w:style w:type="paragraph" w:styleId="a">
     <w:name w:val="List Bullet"/>
-    <w:basedOn w:val="Normal"/>
+    <w:basedOn w:val="a1"/>
     <w:uiPriority w:val="99"/>
     <w:unhideWhenUsed/>
     <w:qFormat/>
@@ -17539,9 +17473,9 @@
       <w:kern w:val="20"/>
     </w:rPr>
   </w:style>
-  <w:style w:type="paragraph" w:styleId="ListNumber">
+  <w:style w:type="paragraph" w:styleId="a0">
     <w:name w:val="List Number"/>
-    <w:basedOn w:val="Normal"/>
+    <w:basedOn w:val="a1"/>
     <w:uiPriority w:val="1"/>
     <w:unhideWhenUsed/>
     <w:qFormat/>
@@ -17557,9 +17491,9 @@
       <w:kern w:val="20"/>
     </w:rPr>
   </w:style>
-  <w:style w:type="paragraph" w:styleId="ListNumber2">
+  <w:style w:type="paragraph" w:styleId="2">
     <w:name w:val="List Number 2"/>
-    <w:basedOn w:val="Normal"/>
+    <w:basedOn w:val="a1"/>
     <w:uiPriority w:val="1"/>
     <w:unhideWhenUsed/>
     <w:qFormat/>
@@ -17576,9 +17510,9 @@
       <w:kern w:val="20"/>
     </w:rPr>
   </w:style>
-  <w:style w:type="paragraph" w:styleId="ListNumber3">
+  <w:style w:type="paragraph" w:styleId="3">
     <w:name w:val="List Number 3"/>
-    <w:basedOn w:val="Normal"/>
+    <w:basedOn w:val="a1"/>
     <w:uiPriority w:val="18"/>
     <w:unhideWhenUsed/>
     <w:pPr>
@@ -17594,9 +17528,9 @@
       <w:kern w:val="20"/>
     </w:rPr>
   </w:style>
-  <w:style w:type="paragraph" w:styleId="ListNumber4">
+  <w:style w:type="paragraph" w:styleId="4">
     <w:name w:val="List Number 4"/>
-    <w:basedOn w:val="Normal"/>
+    <w:basedOn w:val="a1"/>
     <w:uiPriority w:val="18"/>
     <w:unhideWhenUsed/>
     <w:pPr>
@@ -17612,9 +17546,9 @@
       <w:kern w:val="20"/>
     </w:rPr>
   </w:style>
-  <w:style w:type="paragraph" w:styleId="ListNumber5">
+  <w:style w:type="paragraph" w:styleId="5">
     <w:name w:val="List Number 5"/>
-    <w:basedOn w:val="Normal"/>
+    <w:basedOn w:val="a1"/>
     <w:uiPriority w:val="18"/>
     <w:unhideWhenUsed/>
     <w:pPr>
@@ -17632,7 +17566,7 @@
   </w:style>
   <w:style w:type="table" w:customStyle="1" w:styleId="FinancialTable">
     <w:name w:val="Financial Table"/>
-    <w:basedOn w:val="TableNormal"/>
+    <w:basedOn w:val="a3"/>
     <w:uiPriority w:val="99"/>
     <w:pPr>
       <w:spacing w:before="60" w:after="60" w:line="240" w:lineRule="auto"/>
@@ -17674,9 +17608,9 @@
       </w:rPr>
     </w:tblStylePr>
   </w:style>
-  <w:style w:type="character" w:styleId="CommentReference">
+  <w:style w:type="character" w:styleId="af1">
     <w:name w:val="annotation reference"/>
-    <w:basedOn w:val="DefaultParagraphFont"/>
+    <w:basedOn w:val="a2"/>
     <w:uiPriority w:val="99"/>
     <w:semiHidden/>
     <w:unhideWhenUsed/>
@@ -17684,27 +17618,27 @@
       <w:sz w:val="16"/>
     </w:rPr>
   </w:style>
-  <w:style w:type="paragraph" w:styleId="CommentText">
+  <w:style w:type="paragraph" w:styleId="af2">
     <w:name w:val="annotation text"/>
-    <w:basedOn w:val="Normal"/>
-    <w:link w:val="CommentTextChar"/>
+    <w:basedOn w:val="a1"/>
+    <w:link w:val="Char7"/>
     <w:uiPriority w:val="99"/>
     <w:unhideWhenUsed/>
     <w:pPr>
       <w:spacing w:line="240" w:lineRule="auto"/>
     </w:pPr>
   </w:style>
-  <w:style w:type="character" w:customStyle="1" w:styleId="CommentTextChar">
-    <w:name w:val="Comment Text Char"/>
-    <w:basedOn w:val="DefaultParagraphFont"/>
-    <w:link w:val="CommentText"/>
+  <w:style w:type="character" w:customStyle="1" w:styleId="Char7">
+    <w:name w:val="نص تعليق Char"/>
+    <w:basedOn w:val="a2"/>
+    <w:link w:val="af2"/>
     <w:uiPriority w:val="99"/>
   </w:style>
-  <w:style w:type="paragraph" w:styleId="CommentSubject">
+  <w:style w:type="paragraph" w:styleId="af3">
     <w:name w:val="annotation subject"/>
-    <w:basedOn w:val="CommentText"/>
-    <w:next w:val="CommentText"/>
-    <w:link w:val="CommentSubjectChar"/>
+    <w:basedOn w:val="af2"/>
+    <w:next w:val="af2"/>
+    <w:link w:val="Char8"/>
     <w:uiPriority w:val="99"/>
     <w:semiHidden/>
     <w:unhideWhenUsed/>
@@ -17713,10 +17647,10 @@
       <w:bCs/>
     </w:rPr>
   </w:style>
-  <w:style w:type="character" w:customStyle="1" w:styleId="CommentSubjectChar">
-    <w:name w:val="Comment Subject Char"/>
-    <w:basedOn w:val="CommentTextChar"/>
-    <w:link w:val="CommentSubject"/>
+  <w:style w:type="character" w:customStyle="1" w:styleId="Char8">
+    <w:name w:val="موضوع تعليق Char"/>
+    <w:basedOn w:val="Char7"/>
+    <w:link w:val="af3"/>
     <w:uiPriority w:val="99"/>
     <w:semiHidden/>
     <w:rPr>
@@ -17724,9 +17658,9 @@
       <w:bCs/>
     </w:rPr>
   </w:style>
-  <w:style w:type="table" w:styleId="LightShading">
+  <w:style w:type="table" w:styleId="af4">
     <w:name w:val="Light Shading"/>
-    <w:basedOn w:val="TableNormal"/>
+    <w:basedOn w:val="a3"/>
     <w:uiPriority w:val="60"/>
     <w:pPr>
       <w:spacing w:after="0" w:line="240" w:lineRule="auto"/>
@@ -17821,7 +17755,7 @@
   </w:style>
   <w:style w:type="paragraph" w:customStyle="1" w:styleId="TableTextDecimal">
     <w:name w:val="Table Text Decimal"/>
-    <w:basedOn w:val="Normal"/>
+    <w:basedOn w:val="a1"/>
     <w:uiPriority w:val="1"/>
     <w:qFormat/>
     <w:pPr>
@@ -17833,7 +17767,7 @@
   </w:style>
   <w:style w:type="paragraph" w:customStyle="1" w:styleId="TableText">
     <w:name w:val="Table Text"/>
-    <w:basedOn w:val="Normal"/>
+    <w:basedOn w:val="a1"/>
     <w:uiPriority w:val="1"/>
     <w:qFormat/>
     <w:pPr>
@@ -17842,7 +17776,7 @@
   </w:style>
   <w:style w:type="paragraph" w:customStyle="1" w:styleId="Organization">
     <w:name w:val="Organization"/>
-    <w:basedOn w:val="Normal"/>
+    <w:basedOn w:val="a1"/>
     <w:uiPriority w:val="2"/>
     <w:qFormat/>
     <w:pPr>
@@ -17856,9 +17790,9 @@
       <w:sz w:val="36"/>
     </w:rPr>
   </w:style>
-  <w:style w:type="paragraph" w:styleId="ListParagraph">
+  <w:style w:type="paragraph" w:styleId="af5">
     <w:name w:val="List Paragraph"/>
-    <w:basedOn w:val="Normal"/>
+    <w:basedOn w:val="a1"/>
     <w:uiPriority w:val="34"/>
     <w:qFormat/>
     <w:rsid w:val="001B698D"/>
@@ -17867,9 +17801,9 @@
       <w:contextualSpacing/>
     </w:pPr>
   </w:style>
-  <w:style w:type="paragraph" w:styleId="NormalWeb">
+  <w:style w:type="paragraph" w:styleId="af6">
     <w:name w:val="Normal (Web)"/>
-    <w:basedOn w:val="Normal"/>
+    <w:basedOn w:val="a1"/>
     <w:uiPriority w:val="99"/>
     <w:unhideWhenUsed/>
     <w:rsid w:val="00852E5F"/>
@@ -17886,7 +17820,7 @@
   </w:style>
   <w:style w:type="character" w:styleId="HTMLCode">
     <w:name w:val="HTML Code"/>
-    <w:basedOn w:val="DefaultParagraphFont"/>
+    <w:basedOn w:val="a2"/>
     <w:uiPriority w:val="99"/>
     <w:semiHidden/>
     <w:unhideWhenUsed/>
@@ -17899,17 +17833,17 @@
   </w:style>
   <w:style w:type="character" w:customStyle="1" w:styleId="8">
     <w:name w:val="ͼ8"/>
-    <w:basedOn w:val="DefaultParagraphFont"/>
+    <w:basedOn w:val="a2"/>
     <w:rsid w:val="00A442D9"/>
   </w:style>
   <w:style w:type="character" w:customStyle="1" w:styleId="b">
     <w:name w:val="ͼb"/>
-    <w:basedOn w:val="DefaultParagraphFont"/>
+    <w:basedOn w:val="a2"/>
     <w:rsid w:val="00A442D9"/>
   </w:style>
   <w:style w:type="paragraph" w:customStyle="1" w:styleId="font-claude-response-body">
     <w:name w:val="font-claude-response-body"/>
-    <w:basedOn w:val="Normal"/>
+    <w:basedOn w:val="a1"/>
     <w:rsid w:val="00EC2668"/>
     <w:pPr>
       <w:spacing w:before="100" w:beforeAutospacing="1" w:after="100" w:afterAutospacing="1" w:line="240" w:lineRule="auto"/>
@@ -17924,7 +17858,7 @@
   </w:style>
   <w:style w:type="paragraph" w:customStyle="1" w:styleId="p1">
     <w:name w:val="p1"/>
-    <w:basedOn w:val="Normal"/>
+    <w:basedOn w:val="a1"/>
     <w:rsid w:val="0071712B"/>
     <w:pPr>
       <w:spacing w:after="0" w:line="240" w:lineRule="auto"/>
@@ -17939,7 +17873,7 @@
   </w:style>
   <w:style w:type="paragraph" w:customStyle="1" w:styleId="p2">
     <w:name w:val="p2"/>
-    <w:basedOn w:val="Normal"/>
+    <w:basedOn w:val="a1"/>
     <w:rsid w:val="0071712B"/>
     <w:pPr>
       <w:spacing w:after="0" w:line="240" w:lineRule="auto"/>
@@ -17954,7 +17888,7 @@
   </w:style>
   <w:style w:type="paragraph" w:customStyle="1" w:styleId="p3">
     <w:name w:val="p3"/>
-    <w:basedOn w:val="Normal"/>
+    <w:basedOn w:val="a1"/>
     <w:rsid w:val="0071712B"/>
     <w:pPr>
       <w:spacing w:after="0" w:line="240" w:lineRule="auto"/>
@@ -17967,7 +17901,7 @@
   </w:style>
   <w:style w:type="character" w:customStyle="1" w:styleId="s1">
     <w:name w:val="s1"/>
-    <w:basedOn w:val="DefaultParagraphFont"/>
+    <w:basedOn w:val="a2"/>
     <w:rsid w:val="0071712B"/>
     <w:rPr>
       <w:rFonts w:ascii="Helvetica" w:hAnsi="Helvetica" w:hint="default"/>
@@ -17981,7 +17915,7 @@
   </w:style>
   <w:style w:type="character" w:customStyle="1" w:styleId="s2">
     <w:name w:val="s2"/>
-    <w:basedOn w:val="DefaultParagraphFont"/>
+    <w:basedOn w:val="a2"/>
     <w:rsid w:val="0071712B"/>
     <w:rPr>
       <w:rFonts w:ascii="Times New Roman" w:hAnsi="Times New Roman" w:cs="Times New Roman" w:hint="default"/>
@@ -17995,7 +17929,7 @@
   </w:style>
   <w:style w:type="paragraph" w:customStyle="1" w:styleId="p4">
     <w:name w:val="p4"/>
-    <w:basedOn w:val="Normal"/>
+    <w:basedOn w:val="a1"/>
     <w:rsid w:val="00153A56"/>
     <w:pPr>
       <w:spacing w:after="0" w:line="240" w:lineRule="auto"/>
@@ -18008,7 +17942,7 @@
   </w:style>
   <w:style w:type="character" w:customStyle="1" w:styleId="s3">
     <w:name w:val="s3"/>
-    <w:basedOn w:val="DefaultParagraphFont"/>
+    <w:basedOn w:val="a2"/>
     <w:rsid w:val="00153A56"/>
     <w:rPr>
       <w:rFonts w:ascii="Helvetica" w:hAnsi="Helvetica" w:hint="default"/>
@@ -18022,7 +17956,7 @@
   </w:style>
   <w:style w:type="character" w:customStyle="1" w:styleId="s4">
     <w:name w:val="s4"/>
-    <w:basedOn w:val="DefaultParagraphFont"/>
+    <w:basedOn w:val="a2"/>
     <w:rsid w:val="00153A56"/>
     <w:rPr>
       <w:rFonts w:ascii="TimesNewRomanPS-BoldMT" w:hAnsi="TimesNewRomanPS-BoldMT" w:hint="default"/>
@@ -18036,7 +17970,7 @@
   </w:style>
   <w:style w:type="character" w:customStyle="1" w:styleId="s5">
     <w:name w:val="s5"/>
-    <w:basedOn w:val="DefaultParagraphFont"/>
+    <w:basedOn w:val="a2"/>
     <w:rsid w:val="00153A56"/>
     <w:rPr>
       <w:rFonts w:ascii="Times New Roman" w:hAnsi="Times New Roman" w:cs="Times New Roman" w:hint="default"/>
@@ -18244,7 +18178,7 @@
     <w:lvl w:ilvl="0">
       <w:start w:val="1"/>
       <w:numFmt w:val="bullet"/>
-      <w:pStyle w:val="ListBullet"/>
+      <w:pStyle w:val="a"/>
       <w:lvlText w:val="•"/>
       <w:lvlJc w:val="left"/>
       <w:pPr>
@@ -18278,6 +18212,7 @@
   </w:compat>
   <w:rsids>
     <w:rsidRoot w:val="00324ACF"/>
+    <w:rsid w:val="00032DF6"/>
     <w:rsid w:val="00046943"/>
     <w:rsid w:val="00051231"/>
     <w:rsid w:val="00096A42"/>
@@ -18306,6 +18241,7 @@
     <w:rsid w:val="00695677"/>
     <w:rsid w:val="006D7F43"/>
     <w:rsid w:val="006E2B58"/>
+    <w:rsid w:val="00760BF2"/>
     <w:rsid w:val="008A4AE7"/>
     <w:rsid w:val="00900C2A"/>
     <w:rsid w:val="00902777"/>
@@ -18760,17 +18696,17 @@
     <w:lsdException w:name="Unresolved Mention" w:semiHidden="1" w:unhideWhenUsed="1"/>
     <w:lsdException w:name="Smart Link" w:semiHidden="1" w:unhideWhenUsed="1"/>
   </w:latentStyles>
-  <w:style w:type="paragraph" w:default="1" w:styleId="Normal">
+  <w:style w:type="paragraph" w:default="1" w:styleId="a0">
     <w:name w:val="Normal"/>
     <w:qFormat/>
   </w:style>
-  <w:style w:type="character" w:default="1" w:styleId="DefaultParagraphFont">
+  <w:style w:type="character" w:default="1" w:styleId="a1">
     <w:name w:val="Default Paragraph Font"/>
     <w:uiPriority w:val="1"/>
     <w:semiHidden/>
     <w:unhideWhenUsed/>
   </w:style>
-  <w:style w:type="table" w:default="1" w:styleId="TableNormal">
+  <w:style w:type="table" w:default="1" w:styleId="a2">
     <w:name w:val="Normal Table"/>
     <w:uiPriority w:val="99"/>
     <w:semiHidden/>
@@ -18785,15 +18721,15 @@
       </w:tblCellMar>
     </w:tblPr>
   </w:style>
-  <w:style w:type="numbering" w:default="1" w:styleId="NoList">
+  <w:style w:type="numbering" w:default="1" w:styleId="a3">
     <w:name w:val="No List"/>
     <w:uiPriority w:val="99"/>
     <w:semiHidden/>
     <w:unhideWhenUsed/>
   </w:style>
-  <w:style w:type="paragraph" w:styleId="ListBullet">
+  <w:style w:type="paragraph" w:styleId="a">
     <w:name w:val="List Bullet"/>
-    <w:basedOn w:val="Normal"/>
+    <w:basedOn w:val="a0"/>
     <w:uiPriority w:val="1"/>
     <w:unhideWhenUsed/>
     <w:qFormat/>
@@ -18810,9 +18746,9 @@
       <w:lang w:val="en-US" w:eastAsia="en-US"/>
     </w:rPr>
   </w:style>
-  <w:style w:type="character" w:styleId="Strong">
+  <w:style w:type="character" w:styleId="a4">
     <w:name w:val="Strong"/>
-    <w:basedOn w:val="DefaultParagraphFont"/>
+    <w:basedOn w:val="a1"/>
     <w:uiPriority w:val="10"/>
     <w:qFormat/>
     <w:rPr>

</xml_diff>